<commit_message>
docs: version final del SRS
</commit_message>
<xml_diff>
--- a/SRS_PapelStock_Grupo7.docx
+++ b/SRS_PapelStock_Grupo7.docx
@@ -1,6 +1,6 @@
 
 <file path=word/document.xml><?xml version="1.0" encoding="utf-8"?>
-<w:document xmlns:wpc="http://schemas.microsoft.com/office/word/2010/wordprocessingCanvas" xmlns:cx="http://schemas.microsoft.com/office/drawing/2014/chartex" xmlns:cx1="http://schemas.microsoft.com/office/drawing/2015/9/8/chartex" xmlns:cx2="http://schemas.microsoft.com/office/drawing/2015/10/21/chartex" xmlns:cx3="http://schemas.microsoft.com/office/drawing/2016/5/9/chartex" xmlns:cx4="http://schemas.microsoft.com/office/drawing/2016/5/10/chartex" xmlns:cx5="http://schemas.microsoft.com/office/drawing/2016/5/11/chartex" xmlns:cx6="http://schemas.microsoft.com/office/drawing/2016/5/12/chartex" xmlns:cx7="http://schemas.microsoft.com/office/drawing/2016/5/13/chartex" xmlns:cx8="http://schemas.microsoft.com/office/drawing/2016/5/14/chartex" xmlns:mc="http://schemas.openxmlformats.org/markup-compatibility/2006" xmlns:aink="http://schemas.microsoft.com/office/drawing/2016/ink" xmlns:am3d="http://schemas.microsoft.com/office/drawing/2017/model3d" xmlns:o="urn:schemas-microsoft-com:office:office" xmlns:oel="http://schemas.microsoft.com/office/2019/extlst" xmlns:r="http://schemas.openxmlformats.org/officeDocument/2006/relationships" xmlns:m="http://schemas.openxmlformats.org/officeDocument/2006/math" xmlns:v="urn:schemas-microsoft-com:vml" xmlns:wp14="http://schemas.microsoft.com/office/word/2010/wordprocessingDrawing" xmlns:wp="http://schemas.openxmlformats.org/drawingml/2006/wordprocessingDrawing" xmlns:w10="urn:schemas-microsoft-com:office:word" xmlns:w="http://schemas.openxmlformats.org/wordprocessingml/2006/main" xmlns:w14="http://schemas.microsoft.com/office/word/2010/wordml" xmlns:w15="http://schemas.microsoft.com/office/word/2012/wordml" xmlns:w16cex="http://schemas.microsoft.com/office/word/2018/wordml/cex" xmlns:w16cid="http://schemas.microsoft.com/office/word/2016/wordml/cid" xmlns:w16="http://schemas.microsoft.com/office/word/2018/wordml" xmlns:w16du="http://schemas.microsoft.com/office/word/2023/wordml/word16du" xmlns:w16sdtdh="http://schemas.microsoft.com/office/word/2020/wordml/sdtdatahash" xmlns:w16sdtfl="http://schemas.microsoft.com/office/word/2024/wordml/sdtformatlock" xmlns:w16se="http://schemas.microsoft.com/office/word/2015/wordml/symex" xmlns:wpg="http://schemas.microsoft.com/office/word/2010/wordprocessingGroup" xmlns:wpi="http://schemas.microsoft.com/office/word/2010/wordprocessingInk" xmlns:wne="http://schemas.microsoft.com/office/word/2006/wordml" xmlns:wps="http://schemas.microsoft.com/office/word/2010/wordprocessingShape" mc:Ignorable="w14 w15 w16se w16cid w16 w16cex w16sdtdh w16sdtfl w16du wp14">
+<w:document xmlns:wpc="http://schemas.microsoft.com/office/word/2010/wordprocessingCanvas" xmlns:cx="http://schemas.microsoft.com/office/drawing/2014/chartex" xmlns:cx1="http://schemas.microsoft.com/office/drawing/2015/9/8/chartex" xmlns:cx2="http://schemas.microsoft.com/office/drawing/2015/10/21/chartex" xmlns:cx3="http://schemas.microsoft.com/office/drawing/2016/5/9/chartex" xmlns:cx4="http://schemas.microsoft.com/office/drawing/2016/5/10/chartex" xmlns:cx5="http://schemas.microsoft.com/office/drawing/2016/5/11/chartex" xmlns:cx6="http://schemas.microsoft.com/office/drawing/2016/5/12/chartex" xmlns:cx7="http://schemas.microsoft.com/office/drawing/2016/5/13/chartex" xmlns:cx8="http://schemas.microsoft.com/office/drawing/2016/5/14/chartex" xmlns:mc="http://schemas.openxmlformats.org/markup-compatibility/2006" xmlns:aink="http://schemas.microsoft.com/office/drawing/2016/ink" xmlns:am3d="http://schemas.microsoft.com/office/drawing/2017/model3d" xmlns:o="urn:schemas-microsoft-com:office:office" xmlns:oel="http://schemas.microsoft.com/office/2019/extlst" xmlns:r="http://schemas.openxmlformats.org/officeDocument/2006/relationships" xmlns:m="http://schemas.openxmlformats.org/officeDocument/2006/math" xmlns:v="urn:schemas-microsoft-com:vml" xmlns:wp14="http://schemas.microsoft.com/office/word/2010/wordprocessingDrawing" xmlns:wp="http://schemas.openxmlformats.org/drawingml/2006/wordprocessingDrawing" xmlns:w10="urn:schemas-microsoft-com:office:word" xmlns:w="http://schemas.openxmlformats.org/wordprocessingml/2006/main" xmlns:w14="http://schemas.microsoft.com/office/word/2010/wordml" xmlns:w15="http://schemas.microsoft.com/office/word/2012/wordml" xmlns:w16cei="http://schemas.microsoft.com/office/word/2026/wordml/cei" xmlns:w16cex="http://schemas.microsoft.com/office/word/2018/wordml/cex" xmlns:w16cid="http://schemas.microsoft.com/office/word/2016/wordml/cid" xmlns:w16="http://schemas.microsoft.com/office/word/2018/wordml" xmlns:w16du="http://schemas.microsoft.com/office/word/2023/wordml/word16du" xmlns:w16sdtdh="http://schemas.microsoft.com/office/word/2020/wordml/sdtdatahash" xmlns:w16sdtfl="http://schemas.microsoft.com/office/word/2024/wordml/sdtformatlock" xmlns:w16se="http://schemas.microsoft.com/office/word/2015/wordml/symex" xmlns:wpg="http://schemas.microsoft.com/office/word/2010/wordprocessingGroup" xmlns:wpi="http://schemas.microsoft.com/office/word/2010/wordprocessingInk" xmlns:wne="http://schemas.microsoft.com/office/word/2006/wordml" xmlns:wps="http://schemas.microsoft.com/office/word/2010/wordprocessingShape" mc:Ignorable="w14 w15 w16se w16cid w16 w16cex w16sdtdh w16sdtfl w16du wp14">
   <w:body>
     <w:p>
       <w:pPr>
@@ -199,27 +199,13 @@
           <w:bCs/>
           <w:color w:val="000000" w:themeColor="text1"/>
         </w:rPr>
-        <w:t>Grupo 7</w:t>
+        <w:t>Grupo 7:</w:t>
       </w:r>
       <w:r>
         <w:rPr>
-          <w:b/>
-          <w:bCs/>
           <w:color w:val="000000" w:themeColor="text1"/>
         </w:rPr>
-        <w:t>:</w:t>
-      </w:r>
-      <w:r>
-        <w:rPr>
-          <w:color w:val="000000" w:themeColor="text1"/>
-        </w:rPr>
-        <w:t xml:space="preserve"> Mayra </w:t>
-      </w:r>
-      <w:r>
-        <w:rPr>
-          <w:color w:val="000000" w:themeColor="text1"/>
-        </w:rPr>
-        <w:t>Buñay Santillan</w:t>
+        <w:t xml:space="preserve"> Mayra Buñay Santillan</w:t>
       </w:r>
     </w:p>
     <w:p>
@@ -431,29 +417,61 @@
     </w:p>
     <w:p>
       <w:pPr>
-        <w:pStyle w:val="Ttulo1"/>
-        <w:spacing w:before="240"/>
+        <w:spacing w:line="240" w:lineRule="auto"/>
         <w:ind w:firstLine="0"/>
-        <w:jc w:val="left"/>
-        <w:rPr>
-          <w:color w:val="000000" w:themeColor="text1"/>
+        <w:jc w:val="center"/>
+        <w:rPr>
+          <w:rFonts w:eastAsia="Times New Roman" w:cs="Times New Roman"/>
+          <w:b/>
+          <w:bCs/>
+          <w:color w:val="000000"/>
+          <w:szCs w:val="24"/>
+          <w:lang w:eastAsia="es-EC"/>
         </w:rPr>
       </w:pPr>
       <w:r>
         <w:rPr>
-          <w:rFonts w:ascii="Times New Roman" w:hAnsi="Times New Roman"/>
-          <w:color w:val="000000" w:themeColor="text1"/>
-          <w:sz w:val="24"/>
+          <w:rFonts w:eastAsia="Times New Roman" w:cs="Times New Roman"/>
+          <w:b/>
+          <w:bCs/>
+          <w:color w:val="000000"/>
+          <w:szCs w:val="24"/>
+          <w:lang w:eastAsia="es-EC"/>
         </w:rPr>
         <w:lastRenderedPageBreak/>
-        <w:t xml:space="preserve">SRS - </w:t>
+        <w:t xml:space="preserve">SRS </w:t>
+      </w:r>
+      <w:r>
+        <w:rPr>
+          <w:rFonts w:eastAsia="Times New Roman" w:cs="Times New Roman"/>
+          <w:b/>
+          <w:bCs/>
+          <w:color w:val="000000"/>
+          <w:szCs w:val="24"/>
+          <w:lang w:eastAsia="es-EC"/>
+        </w:rPr>
+        <w:t>–</w:t>
+      </w:r>
+      <w:r>
+        <w:rPr>
+          <w:rFonts w:eastAsia="Times New Roman" w:cs="Times New Roman"/>
+          <w:b/>
+          <w:bCs/>
+          <w:color w:val="000000"/>
+          <w:szCs w:val="24"/>
+          <w:lang w:eastAsia="es-EC"/>
+        </w:rPr>
+        <w:t xml:space="preserve"> </w:t>
       </w:r>
       <w:proofErr w:type="spellStart"/>
       <w:r>
         <w:rPr>
-          <w:rFonts w:ascii="Times New Roman" w:hAnsi="Times New Roman"/>
-          <w:color w:val="000000" w:themeColor="text1"/>
-          <w:sz w:val="24"/>
+          <w:rFonts w:eastAsia="Times New Roman" w:cs="Times New Roman"/>
+          <w:b/>
+          <w:bCs/>
+          <w:color w:val="000000"/>
+          <w:szCs w:val="24"/>
+          <w:lang w:eastAsia="es-EC"/>
         </w:rPr>
         <w:t>PapelStock</w:t>
       </w:r>
@@ -461,103 +479,216 @@
     </w:p>
     <w:p>
       <w:pPr>
+        <w:spacing w:line="240" w:lineRule="auto"/>
         <w:ind w:firstLine="0"/>
-        <w:rPr>
-          <w:color w:val="000000" w:themeColor="text1"/>
+        <w:jc w:val="left"/>
+        <w:rPr>
+          <w:rFonts w:eastAsia="Times New Roman" w:cs="Times New Roman"/>
+          <w:b/>
+          <w:bCs/>
+          <w:color w:val="000000"/>
+          <w:szCs w:val="24"/>
+          <w:lang w:eastAsia="es-EC"/>
+        </w:rPr>
+      </w:pPr>
+    </w:p>
+    <w:p>
+      <w:pPr>
+        <w:spacing w:line="240" w:lineRule="auto"/>
+        <w:ind w:firstLine="0"/>
+        <w:jc w:val="center"/>
+        <w:rPr>
+          <w:rFonts w:eastAsia="Times New Roman" w:cs="Times New Roman"/>
+          <w:b/>
+          <w:bCs/>
+          <w:color w:val="000000"/>
+          <w:szCs w:val="24"/>
+          <w:lang w:eastAsia="es-EC"/>
         </w:rPr>
       </w:pPr>
       <w:r>
         <w:rPr>
+          <w:rFonts w:eastAsia="Times New Roman" w:cs="Times New Roman"/>
           <w:b/>
-          <w:color w:val="000000" w:themeColor="text1"/>
+          <w:bCs/>
+          <w:color w:val="000000"/>
+          <w:szCs w:val="24"/>
+          <w:lang w:eastAsia="es-EC"/>
         </w:rPr>
         <w:t>Sistema de Inventario Simple para una Papelería</w:t>
       </w:r>
     </w:p>
     <w:p>
       <w:pPr>
-        <w:pStyle w:val="Ttulo2"/>
-        <w:spacing w:before="240"/>
+        <w:spacing w:line="240" w:lineRule="auto"/>
         <w:ind w:firstLine="0"/>
         <w:jc w:val="left"/>
         <w:rPr>
-          <w:color w:val="000000" w:themeColor="text1"/>
+          <w:rFonts w:eastAsia="Times New Roman" w:cs="Times New Roman"/>
+          <w:b/>
+          <w:bCs/>
+          <w:color w:val="000000"/>
+          <w:szCs w:val="24"/>
+          <w:lang w:eastAsia="es-EC"/>
+        </w:rPr>
+      </w:pPr>
+    </w:p>
+    <w:p>
+      <w:pPr>
+        <w:spacing w:line="360" w:lineRule="auto"/>
+        <w:ind w:firstLine="0"/>
+        <w:jc w:val="left"/>
+        <w:rPr>
+          <w:rFonts w:eastAsia="Times New Roman" w:cs="Times New Roman"/>
+          <w:b/>
+          <w:bCs/>
+          <w:color w:val="000000"/>
+          <w:szCs w:val="24"/>
+          <w:lang w:eastAsia="es-EC"/>
         </w:rPr>
       </w:pPr>
       <w:r>
         <w:rPr>
-          <w:rFonts w:ascii="Times New Roman" w:hAnsi="Times New Roman"/>
-          <w:color w:val="000000" w:themeColor="text1"/>
-          <w:sz w:val="24"/>
+          <w:rFonts w:eastAsia="Times New Roman" w:cs="Times New Roman"/>
+          <w:b/>
+          <w:bCs/>
+          <w:color w:val="000000"/>
+          <w:szCs w:val="24"/>
+          <w:lang w:eastAsia="es-EC"/>
         </w:rPr>
         <w:t>Propósito</w:t>
       </w:r>
     </w:p>
     <w:p>
       <w:pPr>
-        <w:rPr>
-          <w:color w:val="000000" w:themeColor="text1"/>
-        </w:rPr>
-      </w:pPr>
+        <w:spacing w:line="360" w:lineRule="auto"/>
+        <w:ind w:firstLine="0"/>
+        <w:jc w:val="left"/>
+        <w:rPr>
+          <w:rFonts w:eastAsia="Times New Roman" w:cs="Times New Roman"/>
+          <w:szCs w:val="24"/>
+          <w:lang w:eastAsia="es-EC"/>
+        </w:rPr>
+      </w:pPr>
+      <w:proofErr w:type="spellStart"/>
       <w:r>
         <w:rPr>
-          <w:color w:val="000000" w:themeColor="text1"/>
-        </w:rPr>
-        <w:t>PapelStock es un sistema de inventario diseñado para una papelería pequeña que permite al vendedor registrar artículos, registrar ventas con descuento automático del stock y alertar cuando un artículo alcanza su stock mínimo. El administrador puede supervisar el inventario y configurar los límites de alerta.</w:t>
+          <w:rFonts w:eastAsia="Times New Roman" w:cs="Times New Roman"/>
+          <w:color w:val="000000"/>
+          <w:szCs w:val="24"/>
+          <w:lang w:eastAsia="es-EC"/>
+        </w:rPr>
+        <w:t>PapelStock</w:t>
+      </w:r>
+      <w:proofErr w:type="spellEnd"/>
+      <w:r>
+        <w:rPr>
+          <w:rFonts w:eastAsia="Times New Roman" w:cs="Times New Roman"/>
+          <w:color w:val="000000"/>
+          <w:szCs w:val="24"/>
+          <w:lang w:eastAsia="es-EC"/>
+        </w:rPr>
+        <w:t xml:space="preserve"> es un sistema de inventario diseñado para una papelería pequeña que permite al vendedor registrar artículos, registrar ventas con descuento automático del stock y alertar cuando un artículo alcanza su stock mínimo. El administrador puede supervisar el inventario y configurar los límites de alerta.</w:t>
       </w:r>
     </w:p>
     <w:p>
       <w:pPr>
-        <w:pStyle w:val="Ttulo2"/>
-        <w:spacing w:before="240"/>
+        <w:spacing w:line="360" w:lineRule="auto"/>
         <w:ind w:firstLine="0"/>
         <w:jc w:val="left"/>
         <w:rPr>
-          <w:color w:val="000000" w:themeColor="text1"/>
+          <w:rFonts w:eastAsia="Times New Roman" w:cs="Times New Roman"/>
+          <w:b/>
+          <w:bCs/>
+          <w:color w:val="000000"/>
+          <w:sz w:val="12"/>
+          <w:szCs w:val="12"/>
+          <w:lang w:eastAsia="es-EC"/>
+        </w:rPr>
+      </w:pPr>
+    </w:p>
+    <w:p>
+      <w:pPr>
+        <w:spacing w:line="360" w:lineRule="auto"/>
+        <w:ind w:firstLine="0"/>
+        <w:jc w:val="left"/>
+        <w:rPr>
+          <w:rFonts w:eastAsia="Times New Roman" w:cs="Times New Roman"/>
+          <w:b/>
+          <w:bCs/>
+          <w:color w:val="000000"/>
+          <w:szCs w:val="24"/>
+          <w:lang w:eastAsia="es-EC"/>
         </w:rPr>
       </w:pPr>
       <w:r>
         <w:rPr>
-          <w:rFonts w:ascii="Times New Roman" w:hAnsi="Times New Roman"/>
-          <w:color w:val="000000" w:themeColor="text1"/>
-          <w:sz w:val="24"/>
+          <w:rFonts w:eastAsia="Times New Roman" w:cs="Times New Roman"/>
+          <w:b/>
+          <w:bCs/>
+          <w:color w:val="000000"/>
+          <w:szCs w:val="24"/>
+          <w:lang w:eastAsia="es-EC"/>
         </w:rPr>
         <w:t>Alcance</w:t>
       </w:r>
     </w:p>
     <w:tbl>
       <w:tblPr>
-        <w:tblStyle w:val="Tablaconcuadrcula"/>
-        <w:tblW w:w="0" w:type="auto"/>
-        <w:jc w:val="center"/>
+        <w:tblW w:w="9598" w:type="dxa"/>
+        <w:tblCellMar>
+          <w:top w:w="15" w:type="dxa"/>
+          <w:left w:w="15" w:type="dxa"/>
+          <w:bottom w:w="15" w:type="dxa"/>
+          <w:right w:w="15" w:type="dxa"/>
+        </w:tblCellMar>
         <w:tblLook w:val="04A0" w:firstRow="1" w:lastRow="0" w:firstColumn="1" w:lastColumn="0" w:noHBand="0" w:noVBand="1"/>
       </w:tblPr>
       <w:tblGrid>
-        <w:gridCol w:w="4675"/>
-        <w:gridCol w:w="4675"/>
+        <w:gridCol w:w="5106"/>
+        <w:gridCol w:w="4492"/>
       </w:tblGrid>
       <w:tr>
         <w:trPr>
-          <w:jc w:val="center"/>
+          <w:trHeight w:val="375"/>
         </w:trPr>
         <w:tc>
           <w:tcPr>
-            <w:tcW w:w="4680" w:type="dxa"/>
-            <w:shd w:val="clear" w:color="auto" w:fill="7F7F7F" w:themeFill="text1" w:themeFillTint="80"/>
+            <w:tcW w:w="0" w:type="auto"/>
+            <w:tcBorders>
+              <w:top w:val="single" w:sz="4" w:space="0" w:color="000000"/>
+              <w:left w:val="single" w:sz="4" w:space="0" w:color="000000"/>
+              <w:bottom w:val="single" w:sz="4" w:space="0" w:color="000000"/>
+              <w:right w:val="single" w:sz="4" w:space="0" w:color="000000"/>
+            </w:tcBorders>
+            <w:shd w:val="clear" w:color="auto" w:fill="45818E"/>
+            <w:tcMar>
+              <w:top w:w="0" w:type="dxa"/>
+              <w:left w:w="100" w:type="dxa"/>
+              <w:bottom w:w="0" w:type="dxa"/>
+              <w:right w:w="100" w:type="dxa"/>
+            </w:tcMar>
+            <w:hideMark/>
           </w:tcPr>
           <w:p>
             <w:pPr>
-              <w:spacing w:before="40" w:after="40" w:line="240" w:lineRule="auto"/>
+              <w:spacing w:before="40" w:after="40" w:line="360" w:lineRule="auto"/>
               <w:ind w:firstLine="0"/>
               <w:jc w:val="center"/>
               <w:rPr>
-                <w:color w:val="000000" w:themeColor="text1"/>
+                <w:rFonts w:eastAsia="Times New Roman" w:cs="Times New Roman"/>
+                <w:szCs w:val="24"/>
+                <w:lang w:eastAsia="es-EC"/>
               </w:rPr>
             </w:pPr>
             <w:r>
               <w:rPr>
+                <w:rFonts w:eastAsia="Times New Roman" w:cs="Times New Roman"/>
                 <w:b/>
-                <w:color w:val="000000" w:themeColor="text1"/>
+                <w:bCs/>
+                <w:color w:val="000000"/>
+                <w:szCs w:val="24"/>
+                <w:lang w:eastAsia="es-EC"/>
               </w:rPr>
               <w:t>Qué hace</w:t>
             </w:r>
@@ -565,47 +696,85 @@
         </w:tc>
         <w:tc>
           <w:tcPr>
-            <w:tcW w:w="4680" w:type="dxa"/>
-            <w:shd w:val="clear" w:color="auto" w:fill="7F7F7F" w:themeFill="text1" w:themeFillTint="80"/>
+            <w:tcW w:w="4492" w:type="dxa"/>
+            <w:tcBorders>
+              <w:top w:val="single" w:sz="4" w:space="0" w:color="000000"/>
+              <w:left w:val="single" w:sz="4" w:space="0" w:color="000000"/>
+              <w:bottom w:val="single" w:sz="4" w:space="0" w:color="000000"/>
+              <w:right w:val="single" w:sz="4" w:space="0" w:color="000000"/>
+            </w:tcBorders>
+            <w:shd w:val="clear" w:color="auto" w:fill="45818E"/>
+            <w:tcMar>
+              <w:top w:w="0" w:type="dxa"/>
+              <w:left w:w="100" w:type="dxa"/>
+              <w:bottom w:w="0" w:type="dxa"/>
+              <w:right w:w="100" w:type="dxa"/>
+            </w:tcMar>
+            <w:hideMark/>
           </w:tcPr>
           <w:p>
             <w:pPr>
-              <w:spacing w:before="40" w:after="40" w:line="240" w:lineRule="auto"/>
+              <w:spacing w:before="40" w:after="40" w:line="360" w:lineRule="auto"/>
               <w:ind w:firstLine="0"/>
               <w:jc w:val="center"/>
               <w:rPr>
-                <w:color w:val="000000" w:themeColor="text1"/>
+                <w:rFonts w:eastAsia="Times New Roman" w:cs="Times New Roman"/>
+                <w:szCs w:val="24"/>
+                <w:lang w:eastAsia="es-EC"/>
               </w:rPr>
             </w:pPr>
             <w:r>
               <w:rPr>
+                <w:rFonts w:eastAsia="Times New Roman" w:cs="Times New Roman"/>
                 <w:b/>
-                <w:color w:val="000000" w:themeColor="text1"/>
+                <w:bCs/>
+                <w:color w:val="000000"/>
+                <w:szCs w:val="24"/>
+                <w:lang w:eastAsia="es-EC"/>
               </w:rPr>
-              <w:t>Qué NO hace</w:t>
+              <w:t>Qué No hace</w:t>
             </w:r>
           </w:p>
         </w:tc>
       </w:tr>
       <w:tr>
         <w:trPr>
-          <w:jc w:val="center"/>
+          <w:trHeight w:val="645"/>
         </w:trPr>
         <w:tc>
           <w:tcPr>
-            <w:tcW w:w="4680" w:type="dxa"/>
+            <w:tcW w:w="0" w:type="auto"/>
+            <w:tcBorders>
+              <w:top w:val="single" w:sz="4" w:space="0" w:color="000000"/>
+              <w:left w:val="single" w:sz="4" w:space="0" w:color="000000"/>
+              <w:bottom w:val="single" w:sz="4" w:space="0" w:color="000000"/>
+              <w:right w:val="single" w:sz="4" w:space="0" w:color="000000"/>
+            </w:tcBorders>
+            <w:tcMar>
+              <w:top w:w="0" w:type="dxa"/>
+              <w:left w:w="100" w:type="dxa"/>
+              <w:bottom w:w="0" w:type="dxa"/>
+              <w:right w:w="100" w:type="dxa"/>
+            </w:tcMar>
+            <w:hideMark/>
           </w:tcPr>
           <w:p>
             <w:pPr>
-              <w:spacing w:before="40" w:after="40" w:line="240" w:lineRule="auto"/>
+              <w:spacing w:before="40" w:after="40" w:line="360" w:lineRule="auto"/>
               <w:ind w:firstLine="0"/>
+              <w:jc w:val="left"/>
               <w:rPr>
-                <w:color w:val="000000" w:themeColor="text1"/>
+                <w:rFonts w:eastAsia="Times New Roman" w:cs="Times New Roman"/>
+                <w:szCs w:val="24"/>
+                <w:lang w:eastAsia="es-EC"/>
               </w:rPr>
             </w:pPr>
             <w:r>
               <w:rPr>
-                <w:color w:val="000000" w:themeColor="text1"/>
+                <w:rFonts w:eastAsia="Times New Roman" w:cs="Times New Roman"/>
+                <w:color w:val="000000"/>
+                <w:szCs w:val="24"/>
+                <w:lang w:eastAsia="es-EC"/>
               </w:rPr>
               <w:t>Registrar artículos con nombre, precio y stock inicial</w:t>
             </w:r>
@@ -613,44 +782,82 @@
         </w:tc>
         <w:tc>
           <w:tcPr>
-            <w:tcW w:w="4680" w:type="dxa"/>
+            <w:tcW w:w="4492" w:type="dxa"/>
+            <w:tcBorders>
+              <w:top w:val="single" w:sz="4" w:space="0" w:color="000000"/>
+              <w:left w:val="single" w:sz="4" w:space="0" w:color="000000"/>
+              <w:bottom w:val="single" w:sz="4" w:space="0" w:color="000000"/>
+              <w:right w:val="single" w:sz="4" w:space="0" w:color="000000"/>
+            </w:tcBorders>
+            <w:tcMar>
+              <w:top w:w="0" w:type="dxa"/>
+              <w:left w:w="100" w:type="dxa"/>
+              <w:bottom w:w="0" w:type="dxa"/>
+              <w:right w:w="100" w:type="dxa"/>
+            </w:tcMar>
+            <w:hideMark/>
           </w:tcPr>
           <w:p>
             <w:pPr>
-              <w:spacing w:before="40" w:after="40" w:line="240" w:lineRule="auto"/>
+              <w:spacing w:before="40" w:after="40" w:line="360" w:lineRule="auto"/>
               <w:ind w:firstLine="0"/>
+              <w:jc w:val="left"/>
               <w:rPr>
-                <w:color w:val="000000" w:themeColor="text1"/>
+                <w:rFonts w:eastAsia="Times New Roman" w:cs="Times New Roman"/>
+                <w:szCs w:val="24"/>
+                <w:lang w:eastAsia="es-EC"/>
               </w:rPr>
             </w:pPr>
             <w:r>
               <w:rPr>
-                <w:color w:val="000000" w:themeColor="text1"/>
+                <w:rFonts w:eastAsia="Times New Roman" w:cs="Times New Roman"/>
+                <w:color w:val="000000"/>
+                <w:szCs w:val="24"/>
+                <w:lang w:eastAsia="es-EC"/>
               </w:rPr>
-              <w:t>NO gestiona facturación electrónica</w:t>
+              <w:t>No gestiona facturación electrónica</w:t>
             </w:r>
           </w:p>
         </w:tc>
       </w:tr>
       <w:tr>
         <w:trPr>
-          <w:jc w:val="center"/>
+          <w:trHeight w:val="645"/>
         </w:trPr>
         <w:tc>
           <w:tcPr>
-            <w:tcW w:w="4680" w:type="dxa"/>
+            <w:tcW w:w="0" w:type="auto"/>
+            <w:tcBorders>
+              <w:top w:val="single" w:sz="4" w:space="0" w:color="000000"/>
+              <w:left w:val="single" w:sz="4" w:space="0" w:color="000000"/>
+              <w:bottom w:val="single" w:sz="4" w:space="0" w:color="000000"/>
+              <w:right w:val="single" w:sz="4" w:space="0" w:color="000000"/>
+            </w:tcBorders>
+            <w:tcMar>
+              <w:top w:w="0" w:type="dxa"/>
+              <w:left w:w="100" w:type="dxa"/>
+              <w:bottom w:w="0" w:type="dxa"/>
+              <w:right w:w="100" w:type="dxa"/>
+            </w:tcMar>
+            <w:hideMark/>
           </w:tcPr>
           <w:p>
             <w:pPr>
-              <w:spacing w:before="40" w:after="40" w:line="240" w:lineRule="auto"/>
+              <w:spacing w:before="40" w:after="40" w:line="360" w:lineRule="auto"/>
               <w:ind w:firstLine="0"/>
+              <w:jc w:val="left"/>
               <w:rPr>
-                <w:color w:val="000000" w:themeColor="text1"/>
+                <w:rFonts w:eastAsia="Times New Roman" w:cs="Times New Roman"/>
+                <w:szCs w:val="24"/>
+                <w:lang w:eastAsia="es-EC"/>
               </w:rPr>
             </w:pPr>
             <w:r>
               <w:rPr>
-                <w:color w:val="000000" w:themeColor="text1"/>
+                <w:rFonts w:eastAsia="Times New Roman" w:cs="Times New Roman"/>
+                <w:color w:val="000000"/>
+                <w:szCs w:val="24"/>
+                <w:lang w:eastAsia="es-EC"/>
               </w:rPr>
               <w:t>Registrar ventas que descuentan stock automáticamente</w:t>
             </w:r>
@@ -658,44 +865,82 @@
         </w:tc>
         <w:tc>
           <w:tcPr>
-            <w:tcW w:w="4680" w:type="dxa"/>
+            <w:tcW w:w="4492" w:type="dxa"/>
+            <w:tcBorders>
+              <w:top w:val="single" w:sz="4" w:space="0" w:color="000000"/>
+              <w:left w:val="single" w:sz="4" w:space="0" w:color="000000"/>
+              <w:bottom w:val="single" w:sz="4" w:space="0" w:color="000000"/>
+              <w:right w:val="single" w:sz="4" w:space="0" w:color="000000"/>
+            </w:tcBorders>
+            <w:tcMar>
+              <w:top w:w="0" w:type="dxa"/>
+              <w:left w:w="100" w:type="dxa"/>
+              <w:bottom w:w="0" w:type="dxa"/>
+              <w:right w:w="100" w:type="dxa"/>
+            </w:tcMar>
+            <w:hideMark/>
           </w:tcPr>
           <w:p>
             <w:pPr>
-              <w:spacing w:before="40" w:after="40" w:line="240" w:lineRule="auto"/>
+              <w:spacing w:before="40" w:after="40" w:line="360" w:lineRule="auto"/>
               <w:ind w:firstLine="0"/>
+              <w:jc w:val="left"/>
               <w:rPr>
-                <w:color w:val="000000" w:themeColor="text1"/>
+                <w:rFonts w:eastAsia="Times New Roman" w:cs="Times New Roman"/>
+                <w:szCs w:val="24"/>
+                <w:lang w:eastAsia="es-EC"/>
               </w:rPr>
             </w:pPr>
             <w:r>
               <w:rPr>
-                <w:color w:val="000000" w:themeColor="text1"/>
+                <w:rFonts w:eastAsia="Times New Roman" w:cs="Times New Roman"/>
+                <w:color w:val="000000"/>
+                <w:szCs w:val="24"/>
+                <w:lang w:eastAsia="es-EC"/>
               </w:rPr>
-              <w:t>NO maneja cuentas por cobrar</w:t>
+              <w:t>No maneja cuentas por cobrar</w:t>
             </w:r>
           </w:p>
         </w:tc>
       </w:tr>
       <w:tr>
         <w:trPr>
-          <w:jc w:val="center"/>
+          <w:trHeight w:val="645"/>
         </w:trPr>
         <w:tc>
           <w:tcPr>
-            <w:tcW w:w="4680" w:type="dxa"/>
+            <w:tcW w:w="0" w:type="auto"/>
+            <w:tcBorders>
+              <w:top w:val="single" w:sz="4" w:space="0" w:color="000000"/>
+              <w:left w:val="single" w:sz="4" w:space="0" w:color="000000"/>
+              <w:bottom w:val="single" w:sz="4" w:space="0" w:color="000000"/>
+              <w:right w:val="single" w:sz="4" w:space="0" w:color="000000"/>
+            </w:tcBorders>
+            <w:tcMar>
+              <w:top w:w="0" w:type="dxa"/>
+              <w:left w:w="100" w:type="dxa"/>
+              <w:bottom w:w="0" w:type="dxa"/>
+              <w:right w:w="100" w:type="dxa"/>
+            </w:tcMar>
+            <w:hideMark/>
           </w:tcPr>
           <w:p>
             <w:pPr>
-              <w:spacing w:before="40" w:after="40" w:line="240" w:lineRule="auto"/>
+              <w:spacing w:before="40" w:after="40" w:line="360" w:lineRule="auto"/>
               <w:ind w:firstLine="0"/>
+              <w:jc w:val="left"/>
               <w:rPr>
-                <w:color w:val="000000" w:themeColor="text1"/>
+                <w:rFonts w:eastAsia="Times New Roman" w:cs="Times New Roman"/>
+                <w:szCs w:val="24"/>
+                <w:lang w:eastAsia="es-EC"/>
               </w:rPr>
             </w:pPr>
             <w:r>
               <w:rPr>
-                <w:color w:val="000000" w:themeColor="text1"/>
+                <w:rFonts w:eastAsia="Times New Roman" w:cs="Times New Roman"/>
+                <w:color w:val="000000"/>
+                <w:szCs w:val="24"/>
+                <w:lang w:eastAsia="es-EC"/>
               </w:rPr>
               <w:t>Alertar cuando un artículo baja del stock mínimo</w:t>
             </w:r>
@@ -703,21 +948,40 @@
         </w:tc>
         <w:tc>
           <w:tcPr>
-            <w:tcW w:w="4680" w:type="dxa"/>
+            <w:tcW w:w="4492" w:type="dxa"/>
+            <w:tcBorders>
+              <w:top w:val="single" w:sz="4" w:space="0" w:color="000000"/>
+              <w:left w:val="single" w:sz="4" w:space="0" w:color="000000"/>
+              <w:bottom w:val="single" w:sz="4" w:space="0" w:color="000000"/>
+              <w:right w:val="single" w:sz="4" w:space="0" w:color="000000"/>
+            </w:tcBorders>
+            <w:tcMar>
+              <w:top w:w="0" w:type="dxa"/>
+              <w:left w:w="100" w:type="dxa"/>
+              <w:bottom w:w="0" w:type="dxa"/>
+              <w:right w:w="100" w:type="dxa"/>
+            </w:tcMar>
+            <w:hideMark/>
           </w:tcPr>
           <w:p>
             <w:pPr>
-              <w:spacing w:before="40" w:after="40" w:line="240" w:lineRule="auto"/>
+              <w:spacing w:before="40" w:after="40" w:line="360" w:lineRule="auto"/>
               <w:ind w:firstLine="0"/>
+              <w:jc w:val="left"/>
               <w:rPr>
-                <w:color w:val="000000" w:themeColor="text1"/>
+                <w:rFonts w:eastAsia="Times New Roman" w:cs="Times New Roman"/>
+                <w:szCs w:val="24"/>
+                <w:lang w:eastAsia="es-EC"/>
               </w:rPr>
             </w:pPr>
             <w:r>
               <w:rPr>
-                <w:color w:val="000000" w:themeColor="text1"/>
+                <w:rFonts w:eastAsia="Times New Roman" w:cs="Times New Roman"/>
+                <w:color w:val="000000"/>
+                <w:szCs w:val="24"/>
+                <w:lang w:eastAsia="es-EC"/>
               </w:rPr>
-              <w:t>NO genera reportes contables</w:t>
+              <w:t>No genera reportes contables</w:t>
             </w:r>
           </w:p>
         </w:tc>
@@ -725,56 +989,102 @@
     </w:tbl>
     <w:p>
       <w:pPr>
-        <w:pStyle w:val="Ttulo2"/>
-        <w:spacing w:before="240"/>
+        <w:spacing w:line="360" w:lineRule="auto"/>
         <w:ind w:firstLine="0"/>
         <w:jc w:val="left"/>
         <w:rPr>
-          <w:color w:val="000000" w:themeColor="text1"/>
+          <w:rFonts w:eastAsia="Times New Roman" w:cs="Times New Roman"/>
+          <w:b/>
+          <w:bCs/>
+          <w:color w:val="000000"/>
+          <w:sz w:val="12"/>
+          <w:szCs w:val="12"/>
+          <w:lang w:eastAsia="es-EC"/>
+        </w:rPr>
+      </w:pPr>
+    </w:p>
+    <w:p>
+      <w:pPr>
+        <w:spacing w:line="360" w:lineRule="auto"/>
+        <w:ind w:firstLine="0"/>
+        <w:jc w:val="left"/>
+        <w:rPr>
+          <w:rFonts w:eastAsia="Times New Roman" w:cs="Times New Roman"/>
+          <w:b/>
+          <w:bCs/>
+          <w:color w:val="000000"/>
+          <w:szCs w:val="24"/>
+          <w:lang w:eastAsia="es-EC"/>
         </w:rPr>
       </w:pPr>
       <w:r>
         <w:rPr>
-          <w:rFonts w:ascii="Times New Roman" w:hAnsi="Times New Roman"/>
-          <w:color w:val="000000" w:themeColor="text1"/>
-          <w:sz w:val="24"/>
+          <w:rFonts w:eastAsia="Times New Roman" w:cs="Times New Roman"/>
+          <w:b/>
+          <w:bCs/>
+          <w:color w:val="000000"/>
+          <w:szCs w:val="24"/>
+          <w:lang w:eastAsia="es-EC"/>
         </w:rPr>
         <w:t>Actores</w:t>
       </w:r>
     </w:p>
     <w:tbl>
       <w:tblPr>
-        <w:tblStyle w:val="Tablaconcuadrcula"/>
-        <w:tblW w:w="0" w:type="auto"/>
-        <w:jc w:val="center"/>
+        <w:tblW w:w="9598" w:type="dxa"/>
+        <w:tblCellMar>
+          <w:top w:w="15" w:type="dxa"/>
+          <w:left w:w="15" w:type="dxa"/>
+          <w:bottom w:w="15" w:type="dxa"/>
+          <w:right w:w="15" w:type="dxa"/>
+        </w:tblCellMar>
         <w:tblLook w:val="04A0" w:firstRow="1" w:lastRow="0" w:firstColumn="1" w:lastColumn="0" w:noHBand="0" w:noVBand="1"/>
       </w:tblPr>
       <w:tblGrid>
-        <w:gridCol w:w="4675"/>
-        <w:gridCol w:w="4675"/>
+        <w:gridCol w:w="2510"/>
+        <w:gridCol w:w="7088"/>
       </w:tblGrid>
       <w:tr>
         <w:trPr>
-          <w:jc w:val="center"/>
+          <w:trHeight w:val="375"/>
         </w:trPr>
         <w:tc>
           <w:tcPr>
-            <w:tcW w:w="4680" w:type="dxa"/>
-            <w:shd w:val="clear" w:color="auto" w:fill="7F7F7F" w:themeFill="text1" w:themeFillTint="80"/>
+            <w:tcW w:w="2510" w:type="dxa"/>
+            <w:tcBorders>
+              <w:top w:val="single" w:sz="4" w:space="0" w:color="000000"/>
+              <w:left w:val="single" w:sz="4" w:space="0" w:color="000000"/>
+              <w:bottom w:val="single" w:sz="4" w:space="0" w:color="000000"/>
+              <w:right w:val="single" w:sz="4" w:space="0" w:color="000000"/>
+            </w:tcBorders>
+            <w:shd w:val="clear" w:color="auto" w:fill="45818E"/>
+            <w:tcMar>
+              <w:top w:w="0" w:type="dxa"/>
+              <w:left w:w="100" w:type="dxa"/>
+              <w:bottom w:w="0" w:type="dxa"/>
+              <w:right w:w="100" w:type="dxa"/>
+            </w:tcMar>
+            <w:hideMark/>
           </w:tcPr>
           <w:p>
             <w:pPr>
-              <w:spacing w:before="40" w:after="40" w:line="240" w:lineRule="auto"/>
+              <w:spacing w:before="40" w:after="40" w:line="360" w:lineRule="auto"/>
               <w:ind w:firstLine="0"/>
               <w:jc w:val="center"/>
               <w:rPr>
-                <w:color w:val="000000" w:themeColor="text1"/>
+                <w:rFonts w:eastAsia="Times New Roman" w:cs="Times New Roman"/>
+                <w:szCs w:val="24"/>
+                <w:lang w:eastAsia="es-EC"/>
               </w:rPr>
             </w:pPr>
             <w:r>
               <w:rPr>
+                <w:rFonts w:eastAsia="Times New Roman" w:cs="Times New Roman"/>
                 <w:b/>
-                <w:color w:val="000000" w:themeColor="text1"/>
+                <w:bCs/>
+                <w:color w:val="000000"/>
+                <w:szCs w:val="24"/>
+                <w:lang w:eastAsia="es-EC"/>
               </w:rPr>
               <w:t>Actor</w:t>
             </w:r>
@@ -782,22 +1092,41 @@
         </w:tc>
         <w:tc>
           <w:tcPr>
-            <w:tcW w:w="4680" w:type="dxa"/>
-            <w:shd w:val="clear" w:color="auto" w:fill="7F7F7F" w:themeFill="text1" w:themeFillTint="80"/>
+            <w:tcW w:w="7088" w:type="dxa"/>
+            <w:tcBorders>
+              <w:top w:val="single" w:sz="4" w:space="0" w:color="000000"/>
+              <w:left w:val="single" w:sz="4" w:space="0" w:color="000000"/>
+              <w:bottom w:val="single" w:sz="4" w:space="0" w:color="000000"/>
+              <w:right w:val="single" w:sz="4" w:space="0" w:color="000000"/>
+            </w:tcBorders>
+            <w:shd w:val="clear" w:color="auto" w:fill="45818E"/>
+            <w:tcMar>
+              <w:top w:w="0" w:type="dxa"/>
+              <w:left w:w="100" w:type="dxa"/>
+              <w:bottom w:w="0" w:type="dxa"/>
+              <w:right w:w="100" w:type="dxa"/>
+            </w:tcMar>
+            <w:hideMark/>
           </w:tcPr>
           <w:p>
             <w:pPr>
-              <w:spacing w:before="40" w:after="40" w:line="240" w:lineRule="auto"/>
+              <w:spacing w:before="40" w:after="40" w:line="360" w:lineRule="auto"/>
               <w:ind w:firstLine="0"/>
               <w:jc w:val="center"/>
               <w:rPr>
-                <w:color w:val="000000" w:themeColor="text1"/>
+                <w:rFonts w:eastAsia="Times New Roman" w:cs="Times New Roman"/>
+                <w:szCs w:val="24"/>
+                <w:lang w:eastAsia="es-EC"/>
               </w:rPr>
             </w:pPr>
             <w:r>
               <w:rPr>
+                <w:rFonts w:eastAsia="Times New Roman" w:cs="Times New Roman"/>
                 <w:b/>
-                <w:color w:val="000000" w:themeColor="text1"/>
+                <w:bCs/>
+                <w:color w:val="000000"/>
+                <w:szCs w:val="24"/>
+                <w:lang w:eastAsia="es-EC"/>
               </w:rPr>
               <w:t>Descripción</w:t>
             </w:r>
@@ -806,23 +1135,42 @@
       </w:tr>
       <w:tr>
         <w:trPr>
-          <w:jc w:val="center"/>
+          <w:trHeight w:val="435"/>
         </w:trPr>
         <w:tc>
           <w:tcPr>
-            <w:tcW w:w="4680" w:type="dxa"/>
+            <w:tcW w:w="2510" w:type="dxa"/>
+            <w:tcBorders>
+              <w:top w:val="single" w:sz="4" w:space="0" w:color="000000"/>
+              <w:left w:val="single" w:sz="4" w:space="0" w:color="000000"/>
+              <w:bottom w:val="single" w:sz="4" w:space="0" w:color="000000"/>
+              <w:right w:val="single" w:sz="4" w:space="0" w:color="000000"/>
+            </w:tcBorders>
+            <w:tcMar>
+              <w:top w:w="0" w:type="dxa"/>
+              <w:left w:w="100" w:type="dxa"/>
+              <w:bottom w:w="0" w:type="dxa"/>
+              <w:right w:w="100" w:type="dxa"/>
+            </w:tcMar>
+            <w:hideMark/>
           </w:tcPr>
           <w:p>
             <w:pPr>
-              <w:spacing w:before="40" w:after="40" w:line="240" w:lineRule="auto"/>
+              <w:spacing w:before="40" w:after="40" w:line="360" w:lineRule="auto"/>
               <w:ind w:firstLine="0"/>
+              <w:jc w:val="left"/>
               <w:rPr>
-                <w:color w:val="000000" w:themeColor="text1"/>
+                <w:rFonts w:eastAsia="Times New Roman" w:cs="Times New Roman"/>
+                <w:szCs w:val="24"/>
+                <w:lang w:eastAsia="es-EC"/>
               </w:rPr>
             </w:pPr>
             <w:r>
               <w:rPr>
-                <w:color w:val="000000" w:themeColor="text1"/>
+                <w:rFonts w:eastAsia="Times New Roman" w:cs="Times New Roman"/>
+                <w:color w:val="000000"/>
+                <w:szCs w:val="24"/>
+                <w:lang w:eastAsia="es-EC"/>
               </w:rPr>
               <w:t>Vendedor</w:t>
             </w:r>
@@ -830,19 +1178,38 @@
         </w:tc>
         <w:tc>
           <w:tcPr>
-            <w:tcW w:w="4680" w:type="dxa"/>
+            <w:tcW w:w="7088" w:type="dxa"/>
+            <w:tcBorders>
+              <w:top w:val="single" w:sz="4" w:space="0" w:color="000000"/>
+              <w:left w:val="single" w:sz="4" w:space="0" w:color="000000"/>
+              <w:bottom w:val="single" w:sz="4" w:space="0" w:color="000000"/>
+              <w:right w:val="single" w:sz="4" w:space="0" w:color="000000"/>
+            </w:tcBorders>
+            <w:tcMar>
+              <w:top w:w="0" w:type="dxa"/>
+              <w:left w:w="100" w:type="dxa"/>
+              <w:bottom w:w="0" w:type="dxa"/>
+              <w:right w:w="100" w:type="dxa"/>
+            </w:tcMar>
+            <w:hideMark/>
           </w:tcPr>
           <w:p>
             <w:pPr>
-              <w:spacing w:before="40" w:after="40" w:line="240" w:lineRule="auto"/>
+              <w:spacing w:before="40" w:after="40" w:line="360" w:lineRule="auto"/>
               <w:ind w:firstLine="0"/>
+              <w:jc w:val="left"/>
               <w:rPr>
-                <w:color w:val="000000" w:themeColor="text1"/>
+                <w:rFonts w:eastAsia="Times New Roman" w:cs="Times New Roman"/>
+                <w:szCs w:val="24"/>
+                <w:lang w:eastAsia="es-EC"/>
               </w:rPr>
             </w:pPr>
             <w:r>
               <w:rPr>
-                <w:color w:val="000000" w:themeColor="text1"/>
+                <w:rFonts w:eastAsia="Times New Roman" w:cs="Times New Roman"/>
+                <w:color w:val="000000"/>
+                <w:szCs w:val="24"/>
+                <w:lang w:eastAsia="es-EC"/>
               </w:rPr>
               <w:t>Registra ventas, consulta stock, recibe alertas de stock mínimo</w:t>
             </w:r>
@@ -851,23 +1218,42 @@
       </w:tr>
       <w:tr>
         <w:trPr>
-          <w:jc w:val="center"/>
+          <w:trHeight w:val="641"/>
         </w:trPr>
         <w:tc>
           <w:tcPr>
-            <w:tcW w:w="4680" w:type="dxa"/>
+            <w:tcW w:w="2510" w:type="dxa"/>
+            <w:tcBorders>
+              <w:top w:val="single" w:sz="4" w:space="0" w:color="000000"/>
+              <w:left w:val="single" w:sz="4" w:space="0" w:color="000000"/>
+              <w:bottom w:val="single" w:sz="4" w:space="0" w:color="000000"/>
+              <w:right w:val="single" w:sz="4" w:space="0" w:color="000000"/>
+            </w:tcBorders>
+            <w:tcMar>
+              <w:top w:w="0" w:type="dxa"/>
+              <w:left w:w="100" w:type="dxa"/>
+              <w:bottom w:w="0" w:type="dxa"/>
+              <w:right w:w="100" w:type="dxa"/>
+            </w:tcMar>
+            <w:hideMark/>
           </w:tcPr>
           <w:p>
             <w:pPr>
-              <w:spacing w:before="40" w:after="40" w:line="240" w:lineRule="auto"/>
+              <w:spacing w:before="40" w:after="40" w:line="360" w:lineRule="auto"/>
               <w:ind w:firstLine="0"/>
+              <w:jc w:val="left"/>
               <w:rPr>
-                <w:color w:val="000000" w:themeColor="text1"/>
+                <w:rFonts w:eastAsia="Times New Roman" w:cs="Times New Roman"/>
+                <w:szCs w:val="24"/>
+                <w:lang w:eastAsia="es-EC"/>
               </w:rPr>
             </w:pPr>
             <w:r>
               <w:rPr>
-                <w:color w:val="000000" w:themeColor="text1"/>
+                <w:rFonts w:eastAsia="Times New Roman" w:cs="Times New Roman"/>
+                <w:color w:val="000000"/>
+                <w:szCs w:val="24"/>
+                <w:lang w:eastAsia="es-EC"/>
               </w:rPr>
               <w:t>Administrador</w:t>
             </w:r>
@@ -875,19 +1261,38 @@
         </w:tc>
         <w:tc>
           <w:tcPr>
-            <w:tcW w:w="4680" w:type="dxa"/>
+            <w:tcW w:w="7088" w:type="dxa"/>
+            <w:tcBorders>
+              <w:top w:val="single" w:sz="4" w:space="0" w:color="000000"/>
+              <w:left w:val="single" w:sz="4" w:space="0" w:color="000000"/>
+              <w:bottom w:val="single" w:sz="4" w:space="0" w:color="000000"/>
+              <w:right w:val="single" w:sz="4" w:space="0" w:color="000000"/>
+            </w:tcBorders>
+            <w:tcMar>
+              <w:top w:w="0" w:type="dxa"/>
+              <w:left w:w="100" w:type="dxa"/>
+              <w:bottom w:w="0" w:type="dxa"/>
+              <w:right w:w="100" w:type="dxa"/>
+            </w:tcMar>
+            <w:hideMark/>
           </w:tcPr>
           <w:p>
             <w:pPr>
               <w:spacing w:before="40" w:after="40" w:line="240" w:lineRule="auto"/>
               <w:ind w:firstLine="0"/>
+              <w:jc w:val="left"/>
               <w:rPr>
-                <w:color w:val="000000" w:themeColor="text1"/>
+                <w:rFonts w:eastAsia="Times New Roman" w:cs="Times New Roman"/>
+                <w:szCs w:val="24"/>
+                <w:lang w:eastAsia="es-EC"/>
               </w:rPr>
             </w:pPr>
             <w:r>
               <w:rPr>
-                <w:color w:val="000000" w:themeColor="text1"/>
+                <w:rFonts w:eastAsia="Times New Roman" w:cs="Times New Roman"/>
+                <w:color w:val="000000"/>
+                <w:szCs w:val="24"/>
+                <w:lang w:eastAsia="es-EC"/>
               </w:rPr>
               <w:t>Registra artículos nuevos, configura stock mínimo, supervisa inventario</w:t>
             </w:r>
@@ -897,57 +1302,102 @@
     </w:tbl>
     <w:p>
       <w:pPr>
-        <w:pStyle w:val="Ttulo2"/>
-        <w:spacing w:before="240"/>
+        <w:spacing w:line="360" w:lineRule="auto"/>
         <w:ind w:firstLine="0"/>
         <w:jc w:val="left"/>
         <w:rPr>
-          <w:color w:val="000000" w:themeColor="text1"/>
+          <w:rFonts w:eastAsia="Times New Roman" w:cs="Times New Roman"/>
+          <w:b/>
+          <w:bCs/>
+          <w:color w:val="000000"/>
+          <w:szCs w:val="24"/>
+          <w:lang w:eastAsia="es-EC"/>
+        </w:rPr>
+      </w:pPr>
+    </w:p>
+    <w:p>
+      <w:pPr>
+        <w:spacing w:line="360" w:lineRule="auto"/>
+        <w:ind w:firstLine="0"/>
+        <w:jc w:val="left"/>
+        <w:rPr>
+          <w:rFonts w:eastAsia="Times New Roman" w:cs="Times New Roman"/>
+          <w:b/>
+          <w:bCs/>
+          <w:color w:val="000000"/>
+          <w:szCs w:val="24"/>
+          <w:lang w:eastAsia="es-EC"/>
         </w:rPr>
       </w:pPr>
       <w:r>
         <w:rPr>
-          <w:rFonts w:ascii="Times New Roman" w:hAnsi="Times New Roman"/>
-          <w:color w:val="000000" w:themeColor="text1"/>
-          <w:sz w:val="24"/>
+          <w:rFonts w:eastAsia="Times New Roman" w:cs="Times New Roman"/>
+          <w:b/>
+          <w:bCs/>
+          <w:color w:val="000000"/>
+          <w:szCs w:val="24"/>
+          <w:lang w:eastAsia="es-EC"/>
         </w:rPr>
         <w:t>Requisitos Funcionales (RF)</w:t>
       </w:r>
     </w:p>
     <w:tbl>
       <w:tblPr>
-        <w:tblStyle w:val="Tablaconcuadrcula"/>
         <w:tblW w:w="0" w:type="auto"/>
-        <w:jc w:val="center"/>
+        <w:tblCellMar>
+          <w:top w:w="15" w:type="dxa"/>
+          <w:left w:w="15" w:type="dxa"/>
+          <w:bottom w:w="15" w:type="dxa"/>
+          <w:right w:w="15" w:type="dxa"/>
+        </w:tblCellMar>
         <w:tblLook w:val="04A0" w:firstRow="1" w:lastRow="0" w:firstColumn="1" w:lastColumn="0" w:noHBand="0" w:noVBand="1"/>
       </w:tblPr>
       <w:tblGrid>
-        <w:gridCol w:w="3116"/>
-        <w:gridCol w:w="3118"/>
-        <w:gridCol w:w="3116"/>
+        <w:gridCol w:w="951"/>
+        <w:gridCol w:w="7409"/>
+        <w:gridCol w:w="1200"/>
       </w:tblGrid>
       <w:tr>
         <w:trPr>
-          <w:jc w:val="center"/>
+          <w:trHeight w:val="375"/>
         </w:trPr>
         <w:tc>
           <w:tcPr>
-            <w:tcW w:w="3120" w:type="dxa"/>
-            <w:shd w:val="clear" w:color="auto" w:fill="7F7F7F" w:themeFill="text1" w:themeFillTint="80"/>
+            <w:tcW w:w="951" w:type="dxa"/>
+            <w:tcBorders>
+              <w:top w:val="single" w:sz="4" w:space="0" w:color="000000"/>
+              <w:left w:val="single" w:sz="4" w:space="0" w:color="000000"/>
+              <w:bottom w:val="single" w:sz="4" w:space="0" w:color="000000"/>
+              <w:right w:val="single" w:sz="4" w:space="0" w:color="000000"/>
+            </w:tcBorders>
+            <w:shd w:val="clear" w:color="auto" w:fill="45818E"/>
+            <w:tcMar>
+              <w:top w:w="0" w:type="dxa"/>
+              <w:left w:w="100" w:type="dxa"/>
+              <w:bottom w:w="0" w:type="dxa"/>
+              <w:right w:w="100" w:type="dxa"/>
+            </w:tcMar>
+            <w:hideMark/>
           </w:tcPr>
           <w:p>
             <w:pPr>
-              <w:spacing w:before="40" w:after="40" w:line="240" w:lineRule="auto"/>
+              <w:spacing w:before="40" w:after="40" w:line="360" w:lineRule="auto"/>
               <w:ind w:firstLine="0"/>
               <w:jc w:val="center"/>
               <w:rPr>
-                <w:color w:val="000000" w:themeColor="text1"/>
+                <w:rFonts w:eastAsia="Times New Roman" w:cs="Times New Roman"/>
+                <w:szCs w:val="24"/>
+                <w:lang w:eastAsia="es-EC"/>
               </w:rPr>
             </w:pPr>
             <w:r>
               <w:rPr>
+                <w:rFonts w:eastAsia="Times New Roman" w:cs="Times New Roman"/>
                 <w:b/>
-                <w:color w:val="000000" w:themeColor="text1"/>
+                <w:bCs/>
+                <w:color w:val="000000"/>
+                <w:szCs w:val="24"/>
+                <w:lang w:eastAsia="es-EC"/>
               </w:rPr>
               <w:t>Código</w:t>
             </w:r>
@@ -955,22 +1405,41 @@
         </w:tc>
         <w:tc>
           <w:tcPr>
-            <w:tcW w:w="3120" w:type="dxa"/>
-            <w:shd w:val="clear" w:color="auto" w:fill="7F7F7F" w:themeFill="text1" w:themeFillTint="80"/>
+            <w:tcW w:w="7409" w:type="dxa"/>
+            <w:tcBorders>
+              <w:top w:val="single" w:sz="4" w:space="0" w:color="000000"/>
+              <w:left w:val="single" w:sz="4" w:space="0" w:color="000000"/>
+              <w:bottom w:val="single" w:sz="4" w:space="0" w:color="000000"/>
+              <w:right w:val="single" w:sz="4" w:space="0" w:color="000000"/>
+            </w:tcBorders>
+            <w:shd w:val="clear" w:color="auto" w:fill="45818E"/>
+            <w:tcMar>
+              <w:top w:w="0" w:type="dxa"/>
+              <w:left w:w="100" w:type="dxa"/>
+              <w:bottom w:w="0" w:type="dxa"/>
+              <w:right w:w="100" w:type="dxa"/>
+            </w:tcMar>
+            <w:hideMark/>
           </w:tcPr>
           <w:p>
             <w:pPr>
-              <w:spacing w:before="40" w:after="40" w:line="240" w:lineRule="auto"/>
+              <w:spacing w:before="40" w:after="40" w:line="360" w:lineRule="auto"/>
               <w:ind w:firstLine="0"/>
               <w:jc w:val="center"/>
               <w:rPr>
-                <w:color w:val="000000" w:themeColor="text1"/>
+                <w:rFonts w:eastAsia="Times New Roman" w:cs="Times New Roman"/>
+                <w:szCs w:val="24"/>
+                <w:lang w:eastAsia="es-EC"/>
               </w:rPr>
             </w:pPr>
             <w:r>
               <w:rPr>
+                <w:rFonts w:eastAsia="Times New Roman" w:cs="Times New Roman"/>
                 <w:b/>
-                <w:color w:val="000000" w:themeColor="text1"/>
+                <w:bCs/>
+                <w:color w:val="000000"/>
+                <w:szCs w:val="24"/>
+                <w:lang w:eastAsia="es-EC"/>
               </w:rPr>
               <w:t>Requisito</w:t>
             </w:r>
@@ -978,22 +1447,41 @@
         </w:tc>
         <w:tc>
           <w:tcPr>
-            <w:tcW w:w="3120" w:type="dxa"/>
-            <w:shd w:val="clear" w:color="auto" w:fill="7F7F7F" w:themeFill="text1" w:themeFillTint="80"/>
+            <w:tcW w:w="0" w:type="auto"/>
+            <w:tcBorders>
+              <w:top w:val="single" w:sz="4" w:space="0" w:color="000000"/>
+              <w:left w:val="single" w:sz="4" w:space="0" w:color="000000"/>
+              <w:bottom w:val="single" w:sz="4" w:space="0" w:color="000000"/>
+              <w:right w:val="single" w:sz="4" w:space="0" w:color="000000"/>
+            </w:tcBorders>
+            <w:shd w:val="clear" w:color="auto" w:fill="45818E"/>
+            <w:tcMar>
+              <w:top w:w="0" w:type="dxa"/>
+              <w:left w:w="100" w:type="dxa"/>
+              <w:bottom w:w="0" w:type="dxa"/>
+              <w:right w:w="100" w:type="dxa"/>
+            </w:tcMar>
+            <w:hideMark/>
           </w:tcPr>
           <w:p>
             <w:pPr>
-              <w:spacing w:before="40" w:after="40" w:line="240" w:lineRule="auto"/>
+              <w:spacing w:before="40" w:after="40" w:line="360" w:lineRule="auto"/>
               <w:ind w:firstLine="0"/>
               <w:jc w:val="center"/>
               <w:rPr>
-                <w:color w:val="000000" w:themeColor="text1"/>
+                <w:rFonts w:eastAsia="Times New Roman" w:cs="Times New Roman"/>
+                <w:szCs w:val="24"/>
+                <w:lang w:eastAsia="es-EC"/>
               </w:rPr>
             </w:pPr>
             <w:r>
               <w:rPr>
+                <w:rFonts w:eastAsia="Times New Roman" w:cs="Times New Roman"/>
                 <w:b/>
-                <w:color w:val="000000" w:themeColor="text1"/>
+                <w:bCs/>
+                <w:color w:val="000000"/>
+                <w:szCs w:val="24"/>
+                <w:lang w:eastAsia="es-EC"/>
               </w:rPr>
               <w:t>Prioridad</w:t>
             </w:r>
@@ -1002,23 +1490,42 @@
       </w:tr>
       <w:tr>
         <w:trPr>
-          <w:jc w:val="center"/>
+          <w:trHeight w:val="505"/>
         </w:trPr>
         <w:tc>
           <w:tcPr>
-            <w:tcW w:w="3120" w:type="dxa"/>
+            <w:tcW w:w="951" w:type="dxa"/>
+            <w:tcBorders>
+              <w:top w:val="single" w:sz="4" w:space="0" w:color="000000"/>
+              <w:left w:val="single" w:sz="4" w:space="0" w:color="000000"/>
+              <w:bottom w:val="single" w:sz="4" w:space="0" w:color="000000"/>
+              <w:right w:val="single" w:sz="4" w:space="0" w:color="000000"/>
+            </w:tcBorders>
+            <w:tcMar>
+              <w:top w:w="0" w:type="dxa"/>
+              <w:left w:w="100" w:type="dxa"/>
+              <w:bottom w:w="0" w:type="dxa"/>
+              <w:right w:w="100" w:type="dxa"/>
+            </w:tcMar>
+            <w:hideMark/>
           </w:tcPr>
           <w:p>
             <w:pPr>
               <w:spacing w:before="40" w:after="40" w:line="240" w:lineRule="auto"/>
               <w:ind w:firstLine="0"/>
+              <w:jc w:val="left"/>
               <w:rPr>
-                <w:color w:val="000000" w:themeColor="text1"/>
+                <w:rFonts w:eastAsia="Times New Roman" w:cs="Times New Roman"/>
+                <w:szCs w:val="24"/>
+                <w:lang w:eastAsia="es-EC"/>
               </w:rPr>
             </w:pPr>
             <w:r>
               <w:rPr>
-                <w:color w:val="000000" w:themeColor="text1"/>
+                <w:rFonts w:eastAsia="Times New Roman" w:cs="Times New Roman"/>
+                <w:color w:val="000000"/>
+                <w:szCs w:val="24"/>
+                <w:lang w:eastAsia="es-EC"/>
               </w:rPr>
               <w:t>RF-01</w:t>
             </w:r>
@@ -1026,19 +1533,38 @@
         </w:tc>
         <w:tc>
           <w:tcPr>
-            <w:tcW w:w="3120" w:type="dxa"/>
+            <w:tcW w:w="7409" w:type="dxa"/>
+            <w:tcBorders>
+              <w:top w:val="single" w:sz="4" w:space="0" w:color="000000"/>
+              <w:left w:val="single" w:sz="4" w:space="0" w:color="000000"/>
+              <w:bottom w:val="single" w:sz="4" w:space="0" w:color="000000"/>
+              <w:right w:val="single" w:sz="4" w:space="0" w:color="000000"/>
+            </w:tcBorders>
+            <w:tcMar>
+              <w:top w:w="0" w:type="dxa"/>
+              <w:left w:w="100" w:type="dxa"/>
+              <w:bottom w:w="0" w:type="dxa"/>
+              <w:right w:w="100" w:type="dxa"/>
+            </w:tcMar>
+            <w:hideMark/>
           </w:tcPr>
           <w:p>
             <w:pPr>
               <w:spacing w:before="40" w:after="40" w:line="240" w:lineRule="auto"/>
               <w:ind w:firstLine="0"/>
+              <w:jc w:val="left"/>
               <w:rPr>
-                <w:color w:val="000000" w:themeColor="text1"/>
+                <w:rFonts w:eastAsia="Times New Roman" w:cs="Times New Roman"/>
+                <w:szCs w:val="24"/>
+                <w:lang w:eastAsia="es-EC"/>
               </w:rPr>
             </w:pPr>
             <w:r>
               <w:rPr>
-                <w:color w:val="000000" w:themeColor="text1"/>
+                <w:rFonts w:eastAsia="Times New Roman" w:cs="Times New Roman"/>
+                <w:color w:val="000000"/>
+                <w:szCs w:val="24"/>
+                <w:lang w:eastAsia="es-EC"/>
               </w:rPr>
               <w:t>El administrador registra un artículo nuevo con nombre, precio, stock inicial y stock mínimo.</w:t>
             </w:r>
@@ -1046,19 +1572,38 @@
         </w:tc>
         <w:tc>
           <w:tcPr>
-            <w:tcW w:w="3120" w:type="dxa"/>
+            <w:tcW w:w="0" w:type="auto"/>
+            <w:tcBorders>
+              <w:top w:val="single" w:sz="4" w:space="0" w:color="000000"/>
+              <w:left w:val="single" w:sz="4" w:space="0" w:color="000000"/>
+              <w:bottom w:val="single" w:sz="4" w:space="0" w:color="000000"/>
+              <w:right w:val="single" w:sz="4" w:space="0" w:color="000000"/>
+            </w:tcBorders>
+            <w:tcMar>
+              <w:top w:w="0" w:type="dxa"/>
+              <w:left w:w="100" w:type="dxa"/>
+              <w:bottom w:w="0" w:type="dxa"/>
+              <w:right w:w="100" w:type="dxa"/>
+            </w:tcMar>
+            <w:hideMark/>
           </w:tcPr>
           <w:p>
             <w:pPr>
               <w:spacing w:before="40" w:after="40" w:line="240" w:lineRule="auto"/>
               <w:ind w:firstLine="0"/>
+              <w:jc w:val="left"/>
               <w:rPr>
-                <w:color w:val="000000" w:themeColor="text1"/>
+                <w:rFonts w:eastAsia="Times New Roman" w:cs="Times New Roman"/>
+                <w:szCs w:val="24"/>
+                <w:lang w:eastAsia="es-EC"/>
               </w:rPr>
             </w:pPr>
             <w:r>
               <w:rPr>
-                <w:color w:val="000000" w:themeColor="text1"/>
+                <w:rFonts w:eastAsia="Times New Roman" w:cs="Times New Roman"/>
+                <w:color w:val="000000"/>
+                <w:szCs w:val="24"/>
+                <w:lang w:eastAsia="es-EC"/>
               </w:rPr>
               <w:t>Alta</w:t>
             </w:r>
@@ -1067,23 +1612,42 @@
       </w:tr>
       <w:tr>
         <w:trPr>
-          <w:jc w:val="center"/>
+          <w:trHeight w:val="556"/>
         </w:trPr>
         <w:tc>
           <w:tcPr>
-            <w:tcW w:w="3120" w:type="dxa"/>
+            <w:tcW w:w="951" w:type="dxa"/>
+            <w:tcBorders>
+              <w:top w:val="single" w:sz="4" w:space="0" w:color="000000"/>
+              <w:left w:val="single" w:sz="4" w:space="0" w:color="000000"/>
+              <w:bottom w:val="single" w:sz="4" w:space="0" w:color="000000"/>
+              <w:right w:val="single" w:sz="4" w:space="0" w:color="000000"/>
+            </w:tcBorders>
+            <w:tcMar>
+              <w:top w:w="0" w:type="dxa"/>
+              <w:left w:w="100" w:type="dxa"/>
+              <w:bottom w:w="0" w:type="dxa"/>
+              <w:right w:w="100" w:type="dxa"/>
+            </w:tcMar>
+            <w:hideMark/>
           </w:tcPr>
           <w:p>
             <w:pPr>
               <w:spacing w:before="40" w:after="40" w:line="240" w:lineRule="auto"/>
               <w:ind w:firstLine="0"/>
+              <w:jc w:val="left"/>
               <w:rPr>
-                <w:color w:val="000000" w:themeColor="text1"/>
+                <w:rFonts w:eastAsia="Times New Roman" w:cs="Times New Roman"/>
+                <w:szCs w:val="24"/>
+                <w:lang w:eastAsia="es-EC"/>
               </w:rPr>
             </w:pPr>
             <w:r>
               <w:rPr>
-                <w:color w:val="000000" w:themeColor="text1"/>
+                <w:rFonts w:eastAsia="Times New Roman" w:cs="Times New Roman"/>
+                <w:color w:val="000000"/>
+                <w:szCs w:val="24"/>
+                <w:lang w:eastAsia="es-EC"/>
               </w:rPr>
               <w:t>RF-02</w:t>
             </w:r>
@@ -1091,48 +1655,78 @@
         </w:tc>
         <w:tc>
           <w:tcPr>
-            <w:tcW w:w="3120" w:type="dxa"/>
+            <w:tcW w:w="7409" w:type="dxa"/>
+            <w:tcBorders>
+              <w:top w:val="single" w:sz="4" w:space="0" w:color="000000"/>
+              <w:left w:val="single" w:sz="4" w:space="0" w:color="000000"/>
+              <w:bottom w:val="single" w:sz="4" w:space="0" w:color="000000"/>
+              <w:right w:val="single" w:sz="4" w:space="0" w:color="000000"/>
+            </w:tcBorders>
+            <w:tcMar>
+              <w:top w:w="0" w:type="dxa"/>
+              <w:left w:w="100" w:type="dxa"/>
+              <w:bottom w:w="0" w:type="dxa"/>
+              <w:right w:w="100" w:type="dxa"/>
+            </w:tcMar>
+            <w:hideMark/>
           </w:tcPr>
           <w:p>
             <w:pPr>
               <w:spacing w:before="40" w:after="40" w:line="240" w:lineRule="auto"/>
               <w:ind w:firstLine="0"/>
+              <w:jc w:val="left"/>
               <w:rPr>
-                <w:color w:val="000000" w:themeColor="text1"/>
+                <w:rFonts w:eastAsia="Times New Roman" w:cs="Times New Roman"/>
+                <w:szCs w:val="24"/>
+                <w:lang w:eastAsia="es-EC"/>
               </w:rPr>
             </w:pPr>
             <w:r>
               <w:rPr>
-                <w:color w:val="000000" w:themeColor="text1"/>
+                <w:rFonts w:eastAsia="Times New Roman" w:cs="Times New Roman"/>
+                <w:color w:val="000000"/>
+                <w:szCs w:val="24"/>
+                <w:lang w:eastAsia="es-EC"/>
               </w:rPr>
-              <w:t xml:space="preserve">El vendedor registra una venta seleccionando un artículo y una cantidad; el sistema </w:t>
-            </w:r>
-            <w:r>
-              <w:rPr>
-                <w:color w:val="000000" w:themeColor="text1"/>
-              </w:rPr>
-              <w:lastRenderedPageBreak/>
-              <w:t>descuenta automáticamente del stock.</w:t>
+              <w:t>El vendedor registra una venta seleccionando un artículo y una cantidad; el sistema descuenta automáticamente del stock.</w:t>
             </w:r>
           </w:p>
         </w:tc>
         <w:tc>
           <w:tcPr>
-            <w:tcW w:w="3120" w:type="dxa"/>
+            <w:tcW w:w="0" w:type="auto"/>
+            <w:tcBorders>
+              <w:top w:val="single" w:sz="4" w:space="0" w:color="000000"/>
+              <w:left w:val="single" w:sz="4" w:space="0" w:color="000000"/>
+              <w:bottom w:val="single" w:sz="4" w:space="0" w:color="000000"/>
+              <w:right w:val="single" w:sz="4" w:space="0" w:color="000000"/>
+            </w:tcBorders>
+            <w:tcMar>
+              <w:top w:w="0" w:type="dxa"/>
+              <w:left w:w="100" w:type="dxa"/>
+              <w:bottom w:w="0" w:type="dxa"/>
+              <w:right w:w="100" w:type="dxa"/>
+            </w:tcMar>
+            <w:hideMark/>
           </w:tcPr>
           <w:p>
             <w:pPr>
               <w:spacing w:before="40" w:after="40" w:line="240" w:lineRule="auto"/>
               <w:ind w:firstLine="0"/>
+              <w:jc w:val="left"/>
               <w:rPr>
-                <w:color w:val="000000" w:themeColor="text1"/>
+                <w:rFonts w:eastAsia="Times New Roman" w:cs="Times New Roman"/>
+                <w:szCs w:val="24"/>
+                <w:lang w:eastAsia="es-EC"/>
               </w:rPr>
             </w:pPr>
             <w:r>
               <w:rPr>
-                <w:color w:val="000000" w:themeColor="text1"/>
+                <w:rFonts w:eastAsia="Times New Roman" w:cs="Times New Roman"/>
+                <w:color w:val="000000"/>
+                <w:szCs w:val="24"/>
+                <w:lang w:eastAsia="es-EC"/>
               </w:rPr>
-              <w:lastRenderedPageBreak/>
               <w:t>Alta</w:t>
             </w:r>
           </w:p>
@@ -1140,24 +1734,42 @@
       </w:tr>
       <w:tr>
         <w:trPr>
-          <w:trHeight w:val="581"/>
-          <w:jc w:val="center"/>
+          <w:trHeight w:val="623"/>
         </w:trPr>
         <w:tc>
           <w:tcPr>
-            <w:tcW w:w="3120" w:type="dxa"/>
+            <w:tcW w:w="951" w:type="dxa"/>
+            <w:tcBorders>
+              <w:top w:val="single" w:sz="4" w:space="0" w:color="000000"/>
+              <w:left w:val="single" w:sz="4" w:space="0" w:color="000000"/>
+              <w:bottom w:val="single" w:sz="4" w:space="0" w:color="000000"/>
+              <w:right w:val="single" w:sz="4" w:space="0" w:color="000000"/>
+            </w:tcBorders>
+            <w:tcMar>
+              <w:top w:w="0" w:type="dxa"/>
+              <w:left w:w="100" w:type="dxa"/>
+              <w:bottom w:w="0" w:type="dxa"/>
+              <w:right w:w="100" w:type="dxa"/>
+            </w:tcMar>
+            <w:hideMark/>
           </w:tcPr>
           <w:p>
             <w:pPr>
               <w:spacing w:before="40" w:after="40" w:line="240" w:lineRule="auto"/>
               <w:ind w:firstLine="0"/>
+              <w:jc w:val="left"/>
               <w:rPr>
-                <w:color w:val="000000" w:themeColor="text1"/>
+                <w:rFonts w:eastAsia="Times New Roman" w:cs="Times New Roman"/>
+                <w:szCs w:val="24"/>
+                <w:lang w:eastAsia="es-EC"/>
               </w:rPr>
             </w:pPr>
             <w:r>
               <w:rPr>
-                <w:color w:val="000000" w:themeColor="text1"/>
+                <w:rFonts w:eastAsia="Times New Roman" w:cs="Times New Roman"/>
+                <w:color w:val="000000"/>
+                <w:szCs w:val="24"/>
+                <w:lang w:eastAsia="es-EC"/>
               </w:rPr>
               <w:t>RF-03</w:t>
             </w:r>
@@ -1165,19 +1777,38 @@
         </w:tc>
         <w:tc>
           <w:tcPr>
-            <w:tcW w:w="3120" w:type="dxa"/>
+            <w:tcW w:w="7409" w:type="dxa"/>
+            <w:tcBorders>
+              <w:top w:val="single" w:sz="4" w:space="0" w:color="000000"/>
+              <w:left w:val="single" w:sz="4" w:space="0" w:color="000000"/>
+              <w:bottom w:val="single" w:sz="4" w:space="0" w:color="000000"/>
+              <w:right w:val="single" w:sz="4" w:space="0" w:color="000000"/>
+            </w:tcBorders>
+            <w:tcMar>
+              <w:top w:w="0" w:type="dxa"/>
+              <w:left w:w="100" w:type="dxa"/>
+              <w:bottom w:w="0" w:type="dxa"/>
+              <w:right w:w="100" w:type="dxa"/>
+            </w:tcMar>
+            <w:hideMark/>
           </w:tcPr>
           <w:p>
             <w:pPr>
               <w:spacing w:before="40" w:after="40" w:line="240" w:lineRule="auto"/>
               <w:ind w:firstLine="0"/>
+              <w:jc w:val="left"/>
               <w:rPr>
-                <w:color w:val="000000" w:themeColor="text1"/>
+                <w:rFonts w:eastAsia="Times New Roman" w:cs="Times New Roman"/>
+                <w:szCs w:val="24"/>
+                <w:lang w:eastAsia="es-EC"/>
               </w:rPr>
             </w:pPr>
             <w:r>
               <w:rPr>
-                <w:color w:val="000000" w:themeColor="text1"/>
+                <w:rFonts w:eastAsia="Times New Roman" w:cs="Times New Roman"/>
+                <w:color w:val="000000"/>
+                <w:szCs w:val="24"/>
+                <w:lang w:eastAsia="es-EC"/>
               </w:rPr>
               <w:t>El sistema alerta al vendedor con un mensaje visual cuando un artículo alcanza o está por debajo de su stock mínimo.</w:t>
             </w:r>
@@ -1185,19 +1816,38 @@
         </w:tc>
         <w:tc>
           <w:tcPr>
-            <w:tcW w:w="3120" w:type="dxa"/>
+            <w:tcW w:w="0" w:type="auto"/>
+            <w:tcBorders>
+              <w:top w:val="single" w:sz="4" w:space="0" w:color="000000"/>
+              <w:left w:val="single" w:sz="4" w:space="0" w:color="000000"/>
+              <w:bottom w:val="single" w:sz="4" w:space="0" w:color="000000"/>
+              <w:right w:val="single" w:sz="4" w:space="0" w:color="000000"/>
+            </w:tcBorders>
+            <w:tcMar>
+              <w:top w:w="0" w:type="dxa"/>
+              <w:left w:w="100" w:type="dxa"/>
+              <w:bottom w:w="0" w:type="dxa"/>
+              <w:right w:w="100" w:type="dxa"/>
+            </w:tcMar>
+            <w:hideMark/>
           </w:tcPr>
           <w:p>
             <w:pPr>
               <w:spacing w:before="40" w:after="40" w:line="240" w:lineRule="auto"/>
               <w:ind w:firstLine="0"/>
+              <w:jc w:val="left"/>
               <w:rPr>
-                <w:color w:val="000000" w:themeColor="text1"/>
+                <w:rFonts w:eastAsia="Times New Roman" w:cs="Times New Roman"/>
+                <w:szCs w:val="24"/>
+                <w:lang w:eastAsia="es-EC"/>
               </w:rPr>
             </w:pPr>
             <w:r>
               <w:rPr>
-                <w:color w:val="000000" w:themeColor="text1"/>
+                <w:rFonts w:eastAsia="Times New Roman" w:cs="Times New Roman"/>
+                <w:color w:val="000000"/>
+                <w:szCs w:val="24"/>
+                <w:lang w:eastAsia="es-EC"/>
               </w:rPr>
               <w:t>Media</w:t>
             </w:r>
@@ -1207,64 +1857,103 @@
     </w:tbl>
     <w:p>
       <w:pPr>
-        <w:rPr>
-          <w:color w:val="000000" w:themeColor="text1"/>
+        <w:spacing w:line="360" w:lineRule="auto"/>
+        <w:ind w:firstLine="0"/>
+        <w:jc w:val="left"/>
+        <w:rPr>
+          <w:rFonts w:eastAsia="Times New Roman" w:cs="Times New Roman"/>
+          <w:b/>
+          <w:bCs/>
+          <w:color w:val="000000"/>
+          <w:szCs w:val="24"/>
+          <w:lang w:eastAsia="es-EC"/>
         </w:rPr>
       </w:pPr>
     </w:p>
     <w:p>
       <w:pPr>
-        <w:pStyle w:val="Ttulo2"/>
-        <w:spacing w:before="240"/>
+        <w:spacing w:line="360" w:lineRule="auto"/>
         <w:ind w:firstLine="0"/>
         <w:jc w:val="left"/>
         <w:rPr>
-          <w:color w:val="000000" w:themeColor="text1"/>
+          <w:rFonts w:eastAsia="Times New Roman" w:cs="Times New Roman"/>
+          <w:b/>
+          <w:bCs/>
+          <w:color w:val="000000"/>
+          <w:szCs w:val="24"/>
+          <w:lang w:eastAsia="es-EC"/>
         </w:rPr>
       </w:pPr>
       <w:r>
         <w:rPr>
-          <w:rFonts w:ascii="Times New Roman" w:hAnsi="Times New Roman"/>
-          <w:color w:val="000000" w:themeColor="text1"/>
-          <w:sz w:val="24"/>
-        </w:rPr>
+          <w:rFonts w:eastAsia="Times New Roman" w:cs="Times New Roman"/>
+          <w:b/>
+          <w:bCs/>
+          <w:color w:val="000000"/>
+          <w:szCs w:val="24"/>
+          <w:lang w:eastAsia="es-EC"/>
+        </w:rPr>
+        <w:lastRenderedPageBreak/>
         <w:t>Requisito No Funcional (RNF)</w:t>
       </w:r>
     </w:p>
     <w:tbl>
       <w:tblPr>
-        <w:tblStyle w:val="Tablaconcuadrcula"/>
         <w:tblW w:w="0" w:type="auto"/>
-        <w:jc w:val="center"/>
+        <w:tblCellMar>
+          <w:top w:w="15" w:type="dxa"/>
+          <w:left w:w="15" w:type="dxa"/>
+          <w:bottom w:w="15" w:type="dxa"/>
+          <w:right w:w="15" w:type="dxa"/>
+        </w:tblCellMar>
         <w:tblLook w:val="04A0" w:firstRow="1" w:lastRow="0" w:firstColumn="1" w:lastColumn="0" w:noHBand="0" w:noVBand="1"/>
       </w:tblPr>
       <w:tblGrid>
-        <w:gridCol w:w="3116"/>
-        <w:gridCol w:w="3117"/>
-        <w:gridCol w:w="3117"/>
+        <w:gridCol w:w="1091"/>
+        <w:gridCol w:w="7269"/>
+        <w:gridCol w:w="1200"/>
       </w:tblGrid>
       <w:tr>
         <w:trPr>
-          <w:jc w:val="center"/>
+          <w:trHeight w:val="375"/>
         </w:trPr>
         <w:tc>
           <w:tcPr>
-            <w:tcW w:w="3120" w:type="dxa"/>
-            <w:shd w:val="clear" w:color="auto" w:fill="7F7F7F" w:themeFill="text1" w:themeFillTint="80"/>
+            <w:tcW w:w="1091" w:type="dxa"/>
+            <w:tcBorders>
+              <w:top w:val="single" w:sz="4" w:space="0" w:color="000000"/>
+              <w:left w:val="single" w:sz="4" w:space="0" w:color="000000"/>
+              <w:bottom w:val="single" w:sz="4" w:space="0" w:color="000000"/>
+              <w:right w:val="single" w:sz="4" w:space="0" w:color="000000"/>
+            </w:tcBorders>
+            <w:shd w:val="clear" w:color="auto" w:fill="45818E"/>
+            <w:tcMar>
+              <w:top w:w="0" w:type="dxa"/>
+              <w:left w:w="100" w:type="dxa"/>
+              <w:bottom w:w="0" w:type="dxa"/>
+              <w:right w:w="100" w:type="dxa"/>
+            </w:tcMar>
+            <w:hideMark/>
           </w:tcPr>
           <w:p>
             <w:pPr>
-              <w:spacing w:before="40" w:after="40" w:line="240" w:lineRule="auto"/>
+              <w:spacing w:before="40" w:after="40" w:line="360" w:lineRule="auto"/>
               <w:ind w:firstLine="0"/>
               <w:jc w:val="center"/>
               <w:rPr>
-                <w:color w:val="000000" w:themeColor="text1"/>
+                <w:rFonts w:eastAsia="Times New Roman" w:cs="Times New Roman"/>
+                <w:szCs w:val="24"/>
+                <w:lang w:eastAsia="es-EC"/>
               </w:rPr>
             </w:pPr>
             <w:r>
               <w:rPr>
+                <w:rFonts w:eastAsia="Times New Roman" w:cs="Times New Roman"/>
                 <w:b/>
-                <w:color w:val="000000" w:themeColor="text1"/>
+                <w:bCs/>
+                <w:color w:val="000000"/>
+                <w:szCs w:val="24"/>
+                <w:lang w:eastAsia="es-EC"/>
               </w:rPr>
               <w:t>Código</w:t>
             </w:r>
@@ -1272,22 +1961,41 @@
         </w:tc>
         <w:tc>
           <w:tcPr>
-            <w:tcW w:w="3120" w:type="dxa"/>
-            <w:shd w:val="clear" w:color="auto" w:fill="7F7F7F" w:themeFill="text1" w:themeFillTint="80"/>
+            <w:tcW w:w="7269" w:type="dxa"/>
+            <w:tcBorders>
+              <w:top w:val="single" w:sz="4" w:space="0" w:color="000000"/>
+              <w:left w:val="single" w:sz="4" w:space="0" w:color="000000"/>
+              <w:bottom w:val="single" w:sz="4" w:space="0" w:color="000000"/>
+              <w:right w:val="single" w:sz="4" w:space="0" w:color="000000"/>
+            </w:tcBorders>
+            <w:shd w:val="clear" w:color="auto" w:fill="45818E"/>
+            <w:tcMar>
+              <w:top w:w="0" w:type="dxa"/>
+              <w:left w:w="100" w:type="dxa"/>
+              <w:bottom w:w="0" w:type="dxa"/>
+              <w:right w:w="100" w:type="dxa"/>
+            </w:tcMar>
+            <w:hideMark/>
           </w:tcPr>
           <w:p>
             <w:pPr>
-              <w:spacing w:before="40" w:after="40" w:line="240" w:lineRule="auto"/>
+              <w:spacing w:before="40" w:after="40" w:line="360" w:lineRule="auto"/>
               <w:ind w:firstLine="0"/>
               <w:jc w:val="center"/>
               <w:rPr>
-                <w:color w:val="000000" w:themeColor="text1"/>
+                <w:rFonts w:eastAsia="Times New Roman" w:cs="Times New Roman"/>
+                <w:szCs w:val="24"/>
+                <w:lang w:eastAsia="es-EC"/>
               </w:rPr>
             </w:pPr>
             <w:r>
               <w:rPr>
+                <w:rFonts w:eastAsia="Times New Roman" w:cs="Times New Roman"/>
                 <w:b/>
-                <w:color w:val="000000" w:themeColor="text1"/>
+                <w:bCs/>
+                <w:color w:val="000000"/>
+                <w:szCs w:val="24"/>
+                <w:lang w:eastAsia="es-EC"/>
               </w:rPr>
               <w:t>Requisito</w:t>
             </w:r>
@@ -1295,22 +2003,41 @@
         </w:tc>
         <w:tc>
           <w:tcPr>
-            <w:tcW w:w="3120" w:type="dxa"/>
-            <w:shd w:val="clear" w:color="auto" w:fill="7F7F7F" w:themeFill="text1" w:themeFillTint="80"/>
+            <w:tcW w:w="0" w:type="auto"/>
+            <w:tcBorders>
+              <w:top w:val="single" w:sz="4" w:space="0" w:color="000000"/>
+              <w:left w:val="single" w:sz="4" w:space="0" w:color="000000"/>
+              <w:bottom w:val="single" w:sz="4" w:space="0" w:color="000000"/>
+              <w:right w:val="single" w:sz="4" w:space="0" w:color="000000"/>
+            </w:tcBorders>
+            <w:shd w:val="clear" w:color="auto" w:fill="45818E"/>
+            <w:tcMar>
+              <w:top w:w="0" w:type="dxa"/>
+              <w:left w:w="100" w:type="dxa"/>
+              <w:bottom w:w="0" w:type="dxa"/>
+              <w:right w:w="100" w:type="dxa"/>
+            </w:tcMar>
+            <w:hideMark/>
           </w:tcPr>
           <w:p>
             <w:pPr>
-              <w:spacing w:before="40" w:after="40" w:line="240" w:lineRule="auto"/>
+              <w:spacing w:before="40" w:after="40" w:line="360" w:lineRule="auto"/>
               <w:ind w:firstLine="0"/>
               <w:jc w:val="center"/>
               <w:rPr>
-                <w:color w:val="000000" w:themeColor="text1"/>
+                <w:rFonts w:eastAsia="Times New Roman" w:cs="Times New Roman"/>
+                <w:szCs w:val="24"/>
+                <w:lang w:eastAsia="es-EC"/>
               </w:rPr>
             </w:pPr>
             <w:r>
               <w:rPr>
+                <w:rFonts w:eastAsia="Times New Roman" w:cs="Times New Roman"/>
                 <w:b/>
-                <w:color w:val="000000" w:themeColor="text1"/>
+                <w:bCs/>
+                <w:color w:val="000000"/>
+                <w:szCs w:val="24"/>
+                <w:lang w:eastAsia="es-EC"/>
               </w:rPr>
               <w:t>Prioridad</w:t>
             </w:r>
@@ -1319,23 +2046,42 @@
       </w:tr>
       <w:tr>
         <w:trPr>
-          <w:jc w:val="center"/>
+          <w:trHeight w:val="784"/>
         </w:trPr>
         <w:tc>
           <w:tcPr>
-            <w:tcW w:w="3120" w:type="dxa"/>
+            <w:tcW w:w="1091" w:type="dxa"/>
+            <w:tcBorders>
+              <w:top w:val="single" w:sz="4" w:space="0" w:color="000000"/>
+              <w:left w:val="single" w:sz="4" w:space="0" w:color="000000"/>
+              <w:bottom w:val="single" w:sz="4" w:space="0" w:color="000000"/>
+              <w:right w:val="single" w:sz="4" w:space="0" w:color="000000"/>
+            </w:tcBorders>
+            <w:tcMar>
+              <w:top w:w="0" w:type="dxa"/>
+              <w:left w:w="100" w:type="dxa"/>
+              <w:bottom w:w="0" w:type="dxa"/>
+              <w:right w:w="100" w:type="dxa"/>
+            </w:tcMar>
+            <w:hideMark/>
           </w:tcPr>
           <w:p>
             <w:pPr>
-              <w:spacing w:before="40" w:after="40" w:line="240" w:lineRule="auto"/>
+              <w:spacing w:before="40" w:after="40" w:line="360" w:lineRule="auto"/>
               <w:ind w:firstLine="0"/>
+              <w:jc w:val="left"/>
               <w:rPr>
-                <w:color w:val="000000" w:themeColor="text1"/>
+                <w:rFonts w:eastAsia="Times New Roman" w:cs="Times New Roman"/>
+                <w:szCs w:val="24"/>
+                <w:lang w:eastAsia="es-EC"/>
               </w:rPr>
             </w:pPr>
             <w:r>
               <w:rPr>
-                <w:color w:val="000000" w:themeColor="text1"/>
+                <w:rFonts w:eastAsia="Times New Roman" w:cs="Times New Roman"/>
+                <w:color w:val="000000"/>
+                <w:szCs w:val="24"/>
+                <w:lang w:eastAsia="es-EC"/>
               </w:rPr>
               <w:t>RNF-01</w:t>
             </w:r>
@@ -1343,19 +2089,38 @@
         </w:tc>
         <w:tc>
           <w:tcPr>
-            <w:tcW w:w="3120" w:type="dxa"/>
+            <w:tcW w:w="7269" w:type="dxa"/>
+            <w:tcBorders>
+              <w:top w:val="single" w:sz="4" w:space="0" w:color="000000"/>
+              <w:left w:val="single" w:sz="4" w:space="0" w:color="000000"/>
+              <w:bottom w:val="single" w:sz="4" w:space="0" w:color="000000"/>
+              <w:right w:val="single" w:sz="4" w:space="0" w:color="000000"/>
+            </w:tcBorders>
+            <w:tcMar>
+              <w:top w:w="0" w:type="dxa"/>
+              <w:left w:w="100" w:type="dxa"/>
+              <w:bottom w:w="0" w:type="dxa"/>
+              <w:right w:w="100" w:type="dxa"/>
+            </w:tcMar>
+            <w:hideMark/>
           </w:tcPr>
           <w:p>
             <w:pPr>
               <w:spacing w:before="40" w:after="40" w:line="240" w:lineRule="auto"/>
               <w:ind w:firstLine="0"/>
+              <w:jc w:val="left"/>
               <w:rPr>
-                <w:color w:val="000000" w:themeColor="text1"/>
+                <w:rFonts w:eastAsia="Times New Roman" w:cs="Times New Roman"/>
+                <w:szCs w:val="24"/>
+                <w:lang w:eastAsia="es-EC"/>
               </w:rPr>
             </w:pPr>
             <w:r>
               <w:rPr>
-                <w:color w:val="000000" w:themeColor="text1"/>
+                <w:rFonts w:eastAsia="Times New Roman" w:cs="Times New Roman"/>
+                <w:color w:val="000000"/>
+                <w:szCs w:val="24"/>
+                <w:lang w:eastAsia="es-EC"/>
               </w:rPr>
               <w:t>Solo el administrador puede crear/modificar artículos; el vendedor solo puede vender.</w:t>
             </w:r>
@@ -1363,19 +2128,38 @@
         </w:tc>
         <w:tc>
           <w:tcPr>
-            <w:tcW w:w="3120" w:type="dxa"/>
+            <w:tcW w:w="0" w:type="auto"/>
+            <w:tcBorders>
+              <w:top w:val="single" w:sz="4" w:space="0" w:color="000000"/>
+              <w:left w:val="single" w:sz="4" w:space="0" w:color="000000"/>
+              <w:bottom w:val="single" w:sz="4" w:space="0" w:color="000000"/>
+              <w:right w:val="single" w:sz="4" w:space="0" w:color="000000"/>
+            </w:tcBorders>
+            <w:tcMar>
+              <w:top w:w="0" w:type="dxa"/>
+              <w:left w:w="100" w:type="dxa"/>
+              <w:bottom w:w="0" w:type="dxa"/>
+              <w:right w:w="100" w:type="dxa"/>
+            </w:tcMar>
+            <w:hideMark/>
           </w:tcPr>
           <w:p>
             <w:pPr>
-              <w:spacing w:before="40" w:after="40" w:line="240" w:lineRule="auto"/>
+              <w:spacing w:before="40" w:after="40" w:line="360" w:lineRule="auto"/>
               <w:ind w:firstLine="0"/>
+              <w:jc w:val="left"/>
               <w:rPr>
-                <w:color w:val="000000" w:themeColor="text1"/>
+                <w:rFonts w:eastAsia="Times New Roman" w:cs="Times New Roman"/>
+                <w:szCs w:val="24"/>
+                <w:lang w:eastAsia="es-EC"/>
               </w:rPr>
             </w:pPr>
             <w:r>
               <w:rPr>
-                <w:color w:val="000000" w:themeColor="text1"/>
+                <w:rFonts w:eastAsia="Times New Roman" w:cs="Times New Roman"/>
+                <w:color w:val="000000"/>
+                <w:szCs w:val="24"/>
+                <w:lang w:eastAsia="es-EC"/>
               </w:rPr>
               <w:t>Seguridad</w:t>
             </w:r>
@@ -1385,15 +2169,1251 @@
     </w:tbl>
     <w:p>
       <w:pPr>
-        <w:rPr>
-          <w:color w:val="000000" w:themeColor="text1"/>
+        <w:spacing w:line="360" w:lineRule="auto"/>
+        <w:ind w:firstLine="0"/>
+        <w:jc w:val="left"/>
+        <w:rPr>
+          <w:rFonts w:eastAsia="Times New Roman" w:cs="Times New Roman"/>
+          <w:b/>
+          <w:bCs/>
+          <w:color w:val="000000"/>
+          <w:sz w:val="16"/>
+          <w:szCs w:val="16"/>
+          <w:lang w:eastAsia="es-EC"/>
         </w:rPr>
       </w:pPr>
     </w:p>
     <w:p>
       <w:pPr>
+        <w:spacing w:line="360" w:lineRule="auto"/>
+        <w:ind w:firstLine="0"/>
+        <w:jc w:val="left"/>
+        <w:rPr>
+          <w:rFonts w:eastAsia="Times New Roman" w:cs="Times New Roman"/>
+          <w:b/>
+          <w:bCs/>
+          <w:color w:val="000000"/>
+          <w:szCs w:val="24"/>
+          <w:lang w:eastAsia="es-EC"/>
+        </w:rPr>
+      </w:pPr>
+      <w:r>
+        <w:rPr>
+          <w:rFonts w:eastAsia="Times New Roman" w:cs="Times New Roman"/>
+          <w:b/>
+          <w:bCs/>
+          <w:color w:val="000000"/>
+          <w:szCs w:val="24"/>
+          <w:lang w:eastAsia="es-EC"/>
+        </w:rPr>
+        <w:t>Diagrama de</w:t>
+      </w:r>
+      <w:r>
+        <w:rPr>
+          <w:rFonts w:eastAsia="Times New Roman" w:cs="Times New Roman"/>
+          <w:b/>
+          <w:bCs/>
+          <w:color w:val="000000"/>
+          <w:szCs w:val="24"/>
+          <w:lang w:eastAsia="es-EC"/>
+        </w:rPr>
+        <w:t xml:space="preserve"> Caso de Uso </w:t>
+      </w:r>
+    </w:p>
+    <w:p>
+      <w:pPr>
+        <w:spacing w:line="360" w:lineRule="auto"/>
+        <w:ind w:firstLine="0"/>
+        <w:jc w:val="left"/>
+        <w:rPr>
+          <w:rFonts w:eastAsia="Times New Roman" w:cs="Times New Roman"/>
+          <w:szCs w:val="24"/>
+          <w:lang w:eastAsia="es-EC"/>
+        </w:rPr>
+      </w:pPr>
+      <w:r>
+        <w:rPr>
+          <w:rFonts w:eastAsia="Times New Roman" w:cs="Times New Roman"/>
+          <w:color w:val="000000"/>
+          <w:szCs w:val="24"/>
+          <w:lang w:eastAsia="es-EC"/>
+        </w:rPr>
+        <w:t>En el siguiente diagrama muestra los actores del sistema (Administrador y Vendedor) y los casos de uso asociados a cada uno. El Administrador ejecuta "Registrar artículo", mientras que el Vendedor ejecuta "Registrar venta" y recibe "Alertar stock mínimo"</w:t>
+      </w:r>
+    </w:p>
+    <w:p>
+      <w:pPr>
+        <w:spacing w:line="360" w:lineRule="auto"/>
+        <w:ind w:firstLine="0"/>
+        <w:jc w:val="center"/>
+        <w:rPr>
+          <w:rFonts w:eastAsia="Times New Roman" w:cs="Times New Roman"/>
+          <w:szCs w:val="24"/>
+          <w:lang w:eastAsia="es-EC"/>
+        </w:rPr>
+      </w:pPr>
+      <w:r>
+        <w:rPr>
+          <w:rFonts w:eastAsia="Times New Roman" w:cs="Times New Roman"/>
+          <w:noProof/>
+          <w:color w:val="000000"/>
+          <w:szCs w:val="24"/>
+          <w:lang w:eastAsia="es-EC"/>
+        </w:rPr>
+        <w:drawing>
+          <wp:inline distT="0" distB="0" distL="0" distR="0" wp14:anchorId="5D1A5292" wp14:editId="0B69E17E">
+            <wp:extent cx="5470525" cy="3589020"/>
+            <wp:effectExtent l="0" t="0" r="0" b="0"/>
+            <wp:docPr id="6" name="Imagen 9"/>
+            <wp:cNvGraphicFramePr>
+              <a:graphicFrameLocks xmlns:a="http://schemas.openxmlformats.org/drawingml/2006/main" noChangeAspect="1"/>
+            </wp:cNvGraphicFramePr>
+            <a:graphic xmlns:a="http://schemas.openxmlformats.org/drawingml/2006/main">
+              <a:graphicData uri="http://schemas.openxmlformats.org/drawingml/2006/picture">
+                <pic:pic xmlns:pic="http://schemas.openxmlformats.org/drawingml/2006/picture">
+                  <pic:nvPicPr>
+                    <pic:cNvPr id="0" name="Picture 6"/>
+                    <pic:cNvPicPr>
+                      <a:picLocks noChangeAspect="1" noChangeArrowheads="1"/>
+                    </pic:cNvPicPr>
+                  </pic:nvPicPr>
+                  <pic:blipFill>
+                    <a:blip r:embed="rId9">
+                      <a:extLst>
+                        <a:ext uri="{28A0092B-C50C-407E-A947-70E740481C1C}">
+                          <a14:useLocalDpi xmlns:a14="http://schemas.microsoft.com/office/drawing/2010/main" val="0"/>
+                        </a:ext>
+                      </a:extLst>
+                    </a:blip>
+                    <a:srcRect/>
+                    <a:stretch>
+                      <a:fillRect/>
+                    </a:stretch>
+                  </pic:blipFill>
+                  <pic:spPr bwMode="auto">
+                    <a:xfrm>
+                      <a:off x="0" y="0"/>
+                      <a:ext cx="5478578" cy="3594303"/>
+                    </a:xfrm>
+                    <a:prstGeom prst="rect">
+                      <a:avLst/>
+                    </a:prstGeom>
+                    <a:noFill/>
+                    <a:ln>
+                      <a:noFill/>
+                    </a:ln>
+                  </pic:spPr>
+                </pic:pic>
+              </a:graphicData>
+            </a:graphic>
+          </wp:inline>
+        </w:drawing>
+      </w:r>
+    </w:p>
+    <w:p>
+      <w:pPr>
+        <w:spacing w:line="360" w:lineRule="auto"/>
+        <w:ind w:firstLine="0"/>
+        <w:jc w:val="left"/>
+        <w:rPr>
+          <w:rFonts w:eastAsia="Times New Roman" w:cs="Times New Roman"/>
+          <w:szCs w:val="24"/>
+          <w:lang w:eastAsia="es-EC"/>
+        </w:rPr>
+      </w:pPr>
+    </w:p>
+    <w:p>
+      <w:pPr>
+        <w:spacing w:line="360" w:lineRule="auto"/>
+        <w:ind w:firstLine="0"/>
+        <w:jc w:val="left"/>
+        <w:rPr>
+          <w:rFonts w:eastAsia="Times New Roman" w:cs="Times New Roman"/>
+          <w:szCs w:val="24"/>
+          <w:lang w:eastAsia="es-EC"/>
+        </w:rPr>
+      </w:pPr>
+      <w:r>
+        <w:rPr>
+          <w:rFonts w:eastAsia="Times New Roman" w:cs="Times New Roman"/>
+          <w:b/>
+          <w:bCs/>
+          <w:color w:val="000000"/>
+          <w:szCs w:val="24"/>
+          <w:lang w:eastAsia="es-EC"/>
+        </w:rPr>
+        <w:t>Relación «</w:t>
+      </w:r>
+      <w:proofErr w:type="spellStart"/>
+      <w:r>
+        <w:rPr>
+          <w:rFonts w:eastAsia="Times New Roman" w:cs="Times New Roman"/>
+          <w:b/>
+          <w:bCs/>
+          <w:color w:val="000000"/>
+          <w:szCs w:val="24"/>
+          <w:lang w:eastAsia="es-EC"/>
+        </w:rPr>
+        <w:t>extend</w:t>
+      </w:r>
+      <w:proofErr w:type="spellEnd"/>
+      <w:r>
+        <w:rPr>
+          <w:rFonts w:eastAsia="Times New Roman" w:cs="Times New Roman"/>
+          <w:b/>
+          <w:bCs/>
+          <w:color w:val="000000"/>
+          <w:szCs w:val="24"/>
+          <w:lang w:eastAsia="es-EC"/>
+        </w:rPr>
+        <w:t>»:</w:t>
+      </w:r>
+      <w:r>
+        <w:rPr>
+          <w:rFonts w:eastAsia="Times New Roman" w:cs="Times New Roman"/>
+          <w:color w:val="000000"/>
+          <w:szCs w:val="24"/>
+          <w:lang w:eastAsia="es-EC"/>
+        </w:rPr>
+        <w:t xml:space="preserve"> El caso de uso "Registrar venta" extiende a "Alertar stock mínimo". Esto significa que, después de registrar una venta y descontar el stock, si el stock actual del artículo queda por debajo del stock mínimo definido, se ejecuta automáticamente la alerta de stock mínimo. Es una extensión opcional que solo se activa bajo esa condición.</w:t>
+      </w:r>
+    </w:p>
+    <w:p>
+      <w:pPr>
+        <w:spacing w:line="360" w:lineRule="auto"/>
+        <w:ind w:firstLine="0"/>
+        <w:jc w:val="left"/>
+        <w:rPr>
+          <w:rFonts w:eastAsia="Times New Roman" w:cs="Times New Roman"/>
+          <w:szCs w:val="24"/>
+          <w:lang w:eastAsia="es-EC"/>
+        </w:rPr>
+      </w:pPr>
+    </w:p>
+    <w:p>
+      <w:pPr>
+        <w:spacing w:line="360" w:lineRule="auto"/>
+        <w:ind w:firstLine="0"/>
+        <w:jc w:val="left"/>
+        <w:rPr>
+          <w:rFonts w:eastAsia="Times New Roman" w:cs="Times New Roman"/>
+          <w:szCs w:val="24"/>
+          <w:lang w:eastAsia="es-EC"/>
+        </w:rPr>
+      </w:pPr>
+      <w:r>
+        <w:rPr>
+          <w:rFonts w:eastAsia="Times New Roman" w:cs="Times New Roman"/>
+          <w:b/>
+          <w:bCs/>
+          <w:color w:val="000000"/>
+          <w:szCs w:val="24"/>
+          <w:lang w:eastAsia="es-EC"/>
+        </w:rPr>
+        <w:lastRenderedPageBreak/>
+        <w:t>Relación «</w:t>
+      </w:r>
+      <w:proofErr w:type="spellStart"/>
+      <w:r>
+        <w:rPr>
+          <w:rFonts w:eastAsia="Times New Roman" w:cs="Times New Roman"/>
+          <w:b/>
+          <w:bCs/>
+          <w:color w:val="000000"/>
+          <w:szCs w:val="24"/>
+          <w:lang w:eastAsia="es-EC"/>
+        </w:rPr>
+        <w:t>include</w:t>
+      </w:r>
+      <w:proofErr w:type="spellEnd"/>
+      <w:r>
+        <w:rPr>
+          <w:rFonts w:eastAsia="Times New Roman" w:cs="Times New Roman"/>
+          <w:b/>
+          <w:bCs/>
+          <w:color w:val="000000"/>
+          <w:szCs w:val="24"/>
+          <w:lang w:eastAsia="es-EC"/>
+        </w:rPr>
+        <w:t xml:space="preserve">» (opcional): </w:t>
+      </w:r>
+      <w:r>
+        <w:rPr>
+          <w:rFonts w:eastAsia="Times New Roman" w:cs="Times New Roman"/>
+          <w:color w:val="000000"/>
+          <w:szCs w:val="24"/>
+          <w:lang w:eastAsia="es-EC"/>
+        </w:rPr>
+        <w:t>El caso de uso "Registrar venta" incluye a "Calcular total", lo que indica que cada vez que se registra una venta, siempre se calcula el importe total de la venta como parte del flujo normal.</w:t>
+      </w:r>
+    </w:p>
+    <w:p>
+      <w:pPr>
+        <w:spacing w:line="360" w:lineRule="auto"/>
+        <w:ind w:firstLine="0"/>
+        <w:jc w:val="left"/>
+        <w:rPr>
+          <w:rFonts w:eastAsia="Times New Roman" w:cs="Times New Roman"/>
+          <w:b/>
+          <w:bCs/>
+          <w:color w:val="000000"/>
+          <w:szCs w:val="24"/>
+          <w:lang w:eastAsia="es-EC"/>
+        </w:rPr>
+      </w:pPr>
+    </w:p>
+    <w:p>
+      <w:pPr>
+        <w:spacing w:line="360" w:lineRule="auto"/>
+        <w:ind w:firstLine="0"/>
+        <w:jc w:val="left"/>
+        <w:rPr>
+          <w:rFonts w:eastAsia="Times New Roman" w:cs="Times New Roman"/>
+          <w:szCs w:val="24"/>
+          <w:lang w:eastAsia="es-EC"/>
+        </w:rPr>
+      </w:pPr>
+      <w:r>
+        <w:rPr>
+          <w:rFonts w:eastAsia="Times New Roman" w:cs="Times New Roman"/>
+          <w:b/>
+          <w:bCs/>
+          <w:color w:val="000000"/>
+          <w:szCs w:val="24"/>
+          <w:lang w:eastAsia="es-EC"/>
+        </w:rPr>
+        <w:t>Diagrama de clases </w:t>
+      </w:r>
+    </w:p>
+    <w:p>
+      <w:pPr>
+        <w:spacing w:line="360" w:lineRule="auto"/>
+        <w:ind w:firstLine="0"/>
+        <w:jc w:val="left"/>
+        <w:rPr>
+          <w:rFonts w:eastAsia="Times New Roman" w:cs="Times New Roman"/>
+          <w:szCs w:val="24"/>
+          <w:lang w:eastAsia="es-EC"/>
+        </w:rPr>
+      </w:pPr>
+      <w:r>
+        <w:rPr>
+          <w:rFonts w:eastAsia="Times New Roman" w:cs="Times New Roman"/>
+          <w:color w:val="000000"/>
+          <w:szCs w:val="24"/>
+          <w:lang w:eastAsia="es-EC"/>
+        </w:rPr>
+        <w:t xml:space="preserve">El sistema está compuesto por tres clases principales. La clase </w:t>
+      </w:r>
+      <w:r>
+        <w:rPr>
+          <w:rFonts w:eastAsia="Times New Roman" w:cs="Times New Roman"/>
+          <w:b/>
+          <w:bCs/>
+          <w:color w:val="000000"/>
+          <w:szCs w:val="24"/>
+          <w:lang w:eastAsia="es-EC"/>
+        </w:rPr>
+        <w:t>Usuario</w:t>
+      </w:r>
+      <w:r>
+        <w:rPr>
+          <w:rFonts w:eastAsia="Times New Roman" w:cs="Times New Roman"/>
+          <w:color w:val="000000"/>
+          <w:szCs w:val="24"/>
+          <w:lang w:eastAsia="es-EC"/>
+        </w:rPr>
+        <w:t xml:space="preserve"> representa a las personas que operan el sistema con id, nombre, rol y el método </w:t>
+      </w:r>
+      <w:proofErr w:type="spellStart"/>
+      <w:proofErr w:type="gramStart"/>
+      <w:r>
+        <w:rPr>
+          <w:rFonts w:eastAsia="Times New Roman" w:cs="Times New Roman"/>
+          <w:color w:val="000000"/>
+          <w:szCs w:val="24"/>
+          <w:lang w:eastAsia="es-EC"/>
+        </w:rPr>
+        <w:t>iniciarSesion</w:t>
+      </w:r>
+      <w:proofErr w:type="spellEnd"/>
+      <w:r>
+        <w:rPr>
+          <w:rFonts w:eastAsia="Times New Roman" w:cs="Times New Roman"/>
+          <w:color w:val="000000"/>
+          <w:szCs w:val="24"/>
+          <w:lang w:eastAsia="es-EC"/>
+        </w:rPr>
+        <w:t>(</w:t>
+      </w:r>
+      <w:proofErr w:type="gramEnd"/>
+      <w:r>
+        <w:rPr>
+          <w:rFonts w:eastAsia="Times New Roman" w:cs="Times New Roman"/>
+          <w:color w:val="000000"/>
+          <w:szCs w:val="24"/>
+          <w:lang w:eastAsia="es-EC"/>
+        </w:rPr>
+        <w:t xml:space="preserve">). La clase </w:t>
+      </w:r>
+      <w:r>
+        <w:rPr>
+          <w:rFonts w:eastAsia="Times New Roman" w:cs="Times New Roman"/>
+          <w:b/>
+          <w:bCs/>
+          <w:color w:val="000000"/>
+          <w:szCs w:val="24"/>
+          <w:lang w:eastAsia="es-EC"/>
+        </w:rPr>
+        <w:t>Artículo</w:t>
+      </w:r>
+      <w:r>
+        <w:rPr>
+          <w:rFonts w:eastAsia="Times New Roman" w:cs="Times New Roman"/>
+          <w:color w:val="000000"/>
+          <w:szCs w:val="24"/>
+          <w:lang w:eastAsia="es-EC"/>
+        </w:rPr>
+        <w:t xml:space="preserve"> representa los productos de la papelería y contiene atributos como id, nombre, precio, </w:t>
+      </w:r>
+      <w:proofErr w:type="spellStart"/>
+      <w:r>
+        <w:rPr>
+          <w:rFonts w:eastAsia="Times New Roman" w:cs="Times New Roman"/>
+          <w:color w:val="000000"/>
+          <w:szCs w:val="24"/>
+          <w:lang w:eastAsia="es-EC"/>
+        </w:rPr>
+        <w:t>stockActual</w:t>
+      </w:r>
+      <w:proofErr w:type="spellEnd"/>
+      <w:r>
+        <w:rPr>
+          <w:rFonts w:eastAsia="Times New Roman" w:cs="Times New Roman"/>
+          <w:color w:val="000000"/>
+          <w:szCs w:val="24"/>
+          <w:lang w:eastAsia="es-EC"/>
+        </w:rPr>
+        <w:t xml:space="preserve"> y </w:t>
+      </w:r>
+      <w:proofErr w:type="spellStart"/>
+      <w:r>
+        <w:rPr>
+          <w:rFonts w:eastAsia="Times New Roman" w:cs="Times New Roman"/>
+          <w:color w:val="000000"/>
+          <w:szCs w:val="24"/>
+          <w:lang w:eastAsia="es-EC"/>
+        </w:rPr>
+        <w:t>stockMinimo</w:t>
+      </w:r>
+      <w:proofErr w:type="spellEnd"/>
+      <w:r>
+        <w:rPr>
+          <w:rFonts w:eastAsia="Times New Roman" w:cs="Times New Roman"/>
+          <w:color w:val="000000"/>
+          <w:szCs w:val="24"/>
+          <w:lang w:eastAsia="es-EC"/>
+        </w:rPr>
+        <w:t xml:space="preserve">, con el método </w:t>
+      </w:r>
+      <w:proofErr w:type="spellStart"/>
+      <w:proofErr w:type="gramStart"/>
+      <w:r>
+        <w:rPr>
+          <w:rFonts w:eastAsia="Times New Roman" w:cs="Times New Roman"/>
+          <w:color w:val="000000"/>
+          <w:szCs w:val="24"/>
+          <w:lang w:eastAsia="es-EC"/>
+        </w:rPr>
+        <w:t>descontarStock</w:t>
+      </w:r>
+      <w:proofErr w:type="spellEnd"/>
+      <w:r>
+        <w:rPr>
+          <w:rFonts w:eastAsia="Times New Roman" w:cs="Times New Roman"/>
+          <w:color w:val="000000"/>
+          <w:szCs w:val="24"/>
+          <w:lang w:eastAsia="es-EC"/>
+        </w:rPr>
+        <w:t>(</w:t>
+      </w:r>
+      <w:proofErr w:type="gramEnd"/>
+      <w:r>
+        <w:rPr>
+          <w:rFonts w:eastAsia="Times New Roman" w:cs="Times New Roman"/>
+          <w:color w:val="000000"/>
+          <w:szCs w:val="24"/>
+          <w:lang w:eastAsia="es-EC"/>
+        </w:rPr>
+        <w:t xml:space="preserve">) para modificar el inventario. La clase </w:t>
+      </w:r>
+      <w:r>
+        <w:rPr>
+          <w:rFonts w:eastAsia="Times New Roman" w:cs="Times New Roman"/>
+          <w:b/>
+          <w:bCs/>
+          <w:color w:val="000000"/>
+          <w:szCs w:val="24"/>
+          <w:lang w:eastAsia="es-EC"/>
+        </w:rPr>
+        <w:t>Venta</w:t>
+      </w:r>
+      <w:r>
+        <w:rPr>
+          <w:rFonts w:eastAsia="Times New Roman" w:cs="Times New Roman"/>
+          <w:color w:val="000000"/>
+          <w:szCs w:val="24"/>
+          <w:lang w:eastAsia="es-EC"/>
+        </w:rPr>
+        <w:t xml:space="preserve"> registra las transacciones realizadas con id, fecha, total y el método </w:t>
+      </w:r>
+      <w:proofErr w:type="spellStart"/>
+      <w:proofErr w:type="gramStart"/>
+      <w:r>
+        <w:rPr>
+          <w:rFonts w:eastAsia="Times New Roman" w:cs="Times New Roman"/>
+          <w:color w:val="000000"/>
+          <w:szCs w:val="24"/>
+          <w:lang w:eastAsia="es-EC"/>
+        </w:rPr>
+        <w:t>calcularTotal</w:t>
+      </w:r>
+      <w:proofErr w:type="spellEnd"/>
+      <w:r>
+        <w:rPr>
+          <w:rFonts w:eastAsia="Times New Roman" w:cs="Times New Roman"/>
+          <w:color w:val="000000"/>
+          <w:szCs w:val="24"/>
+          <w:lang w:eastAsia="es-EC"/>
+        </w:rPr>
+        <w:t>(</w:t>
+      </w:r>
+      <w:proofErr w:type="gramEnd"/>
+      <w:r>
+        <w:rPr>
+          <w:rFonts w:eastAsia="Times New Roman" w:cs="Times New Roman"/>
+          <w:color w:val="000000"/>
+          <w:szCs w:val="24"/>
+          <w:lang w:eastAsia="es-EC"/>
+        </w:rPr>
+        <w:t>). La clase Venta se asocia con Artículo (porque una venta contiene artículos) y con Usuario (porque un usuario registra la venta).</w:t>
+      </w:r>
+    </w:p>
+    <w:p>
+      <w:pPr>
+        <w:spacing w:line="360" w:lineRule="auto"/>
+        <w:ind w:firstLine="0"/>
+        <w:jc w:val="left"/>
+        <w:rPr>
+          <w:rFonts w:eastAsia="Times New Roman" w:cs="Times New Roman"/>
+          <w:szCs w:val="24"/>
+          <w:lang w:eastAsia="es-EC"/>
+        </w:rPr>
+      </w:pPr>
+      <w:r>
+        <w:rPr>
+          <w:rFonts w:eastAsia="Times New Roman" w:cs="Times New Roman"/>
+          <w:noProof/>
+          <w:color w:val="000000"/>
+          <w:szCs w:val="24"/>
+          <w:lang w:eastAsia="es-EC"/>
+        </w:rPr>
+        <w:drawing>
+          <wp:inline distT="0" distB="0" distL="0" distR="0" wp14:anchorId="55295712" wp14:editId="3B285F1F">
+            <wp:extent cx="5730240" cy="3360420"/>
+            <wp:effectExtent l="0" t="0" r="3810" b="0"/>
+            <wp:docPr id="7" name="Imagen 8"/>
+            <wp:cNvGraphicFramePr>
+              <a:graphicFrameLocks xmlns:a="http://schemas.openxmlformats.org/drawingml/2006/main" noChangeAspect="1"/>
+            </wp:cNvGraphicFramePr>
+            <a:graphic xmlns:a="http://schemas.openxmlformats.org/drawingml/2006/main">
+              <a:graphicData uri="http://schemas.openxmlformats.org/drawingml/2006/picture">
+                <pic:pic xmlns:pic="http://schemas.openxmlformats.org/drawingml/2006/picture">
+                  <pic:nvPicPr>
+                    <pic:cNvPr id="0" name="Picture 7"/>
+                    <pic:cNvPicPr>
+                      <a:picLocks noChangeAspect="1" noChangeArrowheads="1"/>
+                    </pic:cNvPicPr>
+                  </pic:nvPicPr>
+                  <pic:blipFill>
+                    <a:blip r:embed="rId10">
+                      <a:extLst>
+                        <a:ext uri="{28A0092B-C50C-407E-A947-70E740481C1C}">
+                          <a14:useLocalDpi xmlns:a14="http://schemas.microsoft.com/office/drawing/2010/main" val="0"/>
+                        </a:ext>
+                      </a:extLst>
+                    </a:blip>
+                    <a:srcRect/>
+                    <a:stretch>
+                      <a:fillRect/>
+                    </a:stretch>
+                  </pic:blipFill>
+                  <pic:spPr bwMode="auto">
+                    <a:xfrm>
+                      <a:off x="0" y="0"/>
+                      <a:ext cx="5730240" cy="3360420"/>
+                    </a:xfrm>
+                    <a:prstGeom prst="rect">
+                      <a:avLst/>
+                    </a:prstGeom>
+                    <a:noFill/>
+                    <a:ln>
+                      <a:noFill/>
+                    </a:ln>
+                  </pic:spPr>
+                </pic:pic>
+              </a:graphicData>
+            </a:graphic>
+          </wp:inline>
+        </w:drawing>
+      </w:r>
+    </w:p>
+    <w:p>
+      <w:pPr>
+        <w:spacing w:line="360" w:lineRule="auto"/>
+        <w:ind w:firstLine="0"/>
+        <w:jc w:val="left"/>
+        <w:rPr>
+          <w:rFonts w:eastAsia="Times New Roman" w:cs="Times New Roman"/>
+          <w:szCs w:val="24"/>
+          <w:lang w:eastAsia="es-EC"/>
+        </w:rPr>
+      </w:pPr>
+    </w:p>
+    <w:p>
+      <w:pPr>
+        <w:spacing w:line="360" w:lineRule="auto"/>
+        <w:ind w:firstLine="0"/>
+        <w:jc w:val="left"/>
+        <w:rPr>
+          <w:rFonts w:eastAsia="Times New Roman" w:cs="Times New Roman"/>
+          <w:szCs w:val="24"/>
+          <w:lang w:eastAsia="es-EC"/>
+        </w:rPr>
+      </w:pPr>
+    </w:p>
+    <w:p>
+      <w:pPr>
+        <w:spacing w:line="360" w:lineRule="auto"/>
+        <w:ind w:firstLine="0"/>
+        <w:jc w:val="left"/>
+        <w:rPr>
+          <w:rFonts w:eastAsia="Times New Roman" w:cs="Times New Roman"/>
+          <w:szCs w:val="24"/>
+          <w:lang w:eastAsia="es-EC"/>
+        </w:rPr>
+      </w:pPr>
+    </w:p>
+    <w:p>
+      <w:pPr>
+        <w:spacing w:line="360" w:lineRule="auto"/>
+        <w:ind w:firstLine="0"/>
+        <w:jc w:val="left"/>
+        <w:rPr>
+          <w:rFonts w:eastAsia="Times New Roman" w:cs="Times New Roman"/>
+          <w:szCs w:val="24"/>
+          <w:lang w:eastAsia="es-EC"/>
+        </w:rPr>
+      </w:pPr>
+    </w:p>
+    <w:p>
+      <w:pPr>
+        <w:spacing w:line="360" w:lineRule="auto"/>
+        <w:ind w:firstLine="0"/>
+        <w:jc w:val="left"/>
+        <w:rPr>
+          <w:rFonts w:eastAsia="Times New Roman" w:cs="Times New Roman"/>
+          <w:szCs w:val="24"/>
+          <w:lang w:eastAsia="es-EC"/>
+        </w:rPr>
+      </w:pPr>
+    </w:p>
+    <w:p>
+      <w:pPr>
+        <w:spacing w:line="360" w:lineRule="auto"/>
+        <w:ind w:firstLine="0"/>
+        <w:jc w:val="left"/>
+        <w:rPr>
+          <w:rFonts w:eastAsia="Times New Roman" w:cs="Times New Roman"/>
+          <w:szCs w:val="24"/>
+          <w:lang w:eastAsia="es-EC"/>
+        </w:rPr>
+      </w:pPr>
+    </w:p>
+    <w:p>
+      <w:pPr>
+        <w:spacing w:line="360" w:lineRule="auto"/>
+        <w:ind w:firstLine="0"/>
+        <w:jc w:val="left"/>
+        <w:rPr>
+          <w:rFonts w:eastAsia="Times New Roman" w:cs="Times New Roman"/>
+          <w:b/>
+          <w:bCs/>
+          <w:color w:val="000000"/>
+          <w:szCs w:val="24"/>
+          <w:lang w:eastAsia="es-EC"/>
+        </w:rPr>
+      </w:pPr>
+      <w:r>
+        <w:rPr>
+          <w:rFonts w:eastAsia="Times New Roman" w:cs="Times New Roman"/>
+          <w:b/>
+          <w:bCs/>
+          <w:color w:val="000000"/>
+          <w:szCs w:val="24"/>
+          <w:lang w:eastAsia="es-EC"/>
+        </w:rPr>
+        <w:lastRenderedPageBreak/>
+        <w:t xml:space="preserve">Prototipo </w:t>
+      </w:r>
+      <w:r>
+        <w:rPr>
+          <w:rFonts w:eastAsia="Times New Roman" w:cs="Times New Roman"/>
+          <w:b/>
+          <w:bCs/>
+          <w:color w:val="000000"/>
+          <w:szCs w:val="24"/>
+          <w:lang w:eastAsia="es-EC"/>
+        </w:rPr>
+        <w:t xml:space="preserve">realizado </w:t>
+      </w:r>
+      <w:r>
+        <w:rPr>
+          <w:rFonts w:eastAsia="Times New Roman" w:cs="Times New Roman"/>
+          <w:b/>
+          <w:bCs/>
+          <w:color w:val="000000"/>
+          <w:szCs w:val="24"/>
+          <w:lang w:eastAsia="es-EC"/>
+        </w:rPr>
+        <w:t xml:space="preserve">en </w:t>
+      </w:r>
+      <w:proofErr w:type="spellStart"/>
+      <w:r>
+        <w:rPr>
+          <w:rFonts w:eastAsia="Times New Roman" w:cs="Times New Roman"/>
+          <w:b/>
+          <w:bCs/>
+          <w:color w:val="000000"/>
+          <w:szCs w:val="24"/>
+          <w:lang w:eastAsia="es-EC"/>
+        </w:rPr>
+        <w:t>Figma</w:t>
+      </w:r>
+      <w:proofErr w:type="spellEnd"/>
+      <w:r>
+        <w:rPr>
+          <w:rFonts w:eastAsia="Times New Roman" w:cs="Times New Roman"/>
+          <w:b/>
+          <w:bCs/>
+          <w:color w:val="000000"/>
+          <w:szCs w:val="24"/>
+          <w:lang w:eastAsia="es-EC"/>
+        </w:rPr>
+        <w:t xml:space="preserve">. - </w:t>
+      </w:r>
+      <w:r>
+        <w:rPr>
+          <w:rFonts w:eastAsia="Times New Roman" w:cs="Times New Roman"/>
+          <w:b/>
+          <w:bCs/>
+          <w:color w:val="000000"/>
+          <w:szCs w:val="24"/>
+          <w:lang w:eastAsia="es-EC"/>
+        </w:rPr>
+        <w:t>3 pantallas: una por requisito funcional. </w:t>
+      </w:r>
+    </w:p>
+    <w:p>
+      <w:pPr>
+        <w:spacing w:line="360" w:lineRule="auto"/>
+        <w:ind w:firstLine="0"/>
+        <w:jc w:val="left"/>
+        <w:rPr>
+          <w:rFonts w:eastAsia="Times New Roman" w:cs="Times New Roman"/>
+          <w:szCs w:val="24"/>
+          <w:lang w:eastAsia="es-EC"/>
+        </w:rPr>
+      </w:pPr>
+    </w:p>
+    <w:p>
+      <w:pPr>
+        <w:spacing w:line="360" w:lineRule="auto"/>
+        <w:ind w:firstLine="0"/>
+        <w:jc w:val="left"/>
+        <w:rPr>
+          <w:rFonts w:eastAsia="Times New Roman" w:cs="Times New Roman"/>
+          <w:szCs w:val="24"/>
+          <w:lang w:eastAsia="es-EC"/>
+        </w:rPr>
+      </w:pPr>
+      <w:r>
+        <w:rPr>
+          <w:rFonts w:eastAsia="Times New Roman" w:cs="Times New Roman"/>
+          <w:b/>
+          <w:bCs/>
+          <w:color w:val="000000"/>
+          <w:szCs w:val="24"/>
+          <w:lang w:eastAsia="es-EC"/>
+        </w:rPr>
+        <w:t>Pantalla 1: RF-01.</w:t>
+      </w:r>
+      <w:r>
+        <w:rPr>
+          <w:rFonts w:eastAsia="Times New Roman" w:cs="Times New Roman"/>
+          <w:color w:val="000000"/>
+          <w:szCs w:val="24"/>
+          <w:lang w:eastAsia="es-EC"/>
+        </w:rPr>
+        <w:t xml:space="preserve"> - El administrador registra un artículo nuevo con nombre, precio, stock inicial y stock mínimo.</w:t>
+      </w:r>
+    </w:p>
+    <w:p>
+      <w:pPr>
+        <w:spacing w:line="360" w:lineRule="auto"/>
+        <w:ind w:firstLine="0"/>
+        <w:jc w:val="left"/>
+        <w:rPr>
+          <w:rFonts w:eastAsia="Times New Roman" w:cs="Times New Roman"/>
+          <w:szCs w:val="24"/>
+          <w:lang w:eastAsia="es-EC"/>
+        </w:rPr>
+      </w:pPr>
+      <w:r>
+        <w:rPr>
+          <w:rFonts w:eastAsia="Times New Roman" w:cs="Times New Roman"/>
+          <w:noProof/>
+          <w:color w:val="000000"/>
+          <w:szCs w:val="24"/>
+          <w:lang w:eastAsia="es-EC"/>
+        </w:rPr>
+        <w:drawing>
+          <wp:inline distT="0" distB="0" distL="0" distR="0" wp14:anchorId="0E63F5EF" wp14:editId="2BDE8A79">
+            <wp:extent cx="5539740" cy="3063240"/>
+            <wp:effectExtent l="0" t="0" r="3810" b="3810"/>
+            <wp:docPr id="8" name="Imagen 7"/>
+            <wp:cNvGraphicFramePr>
+              <a:graphicFrameLocks xmlns:a="http://schemas.openxmlformats.org/drawingml/2006/main" noChangeAspect="1"/>
+            </wp:cNvGraphicFramePr>
+            <a:graphic xmlns:a="http://schemas.openxmlformats.org/drawingml/2006/main">
+              <a:graphicData uri="http://schemas.openxmlformats.org/drawingml/2006/picture">
+                <pic:pic xmlns:pic="http://schemas.openxmlformats.org/drawingml/2006/picture">
+                  <pic:nvPicPr>
+                    <pic:cNvPr id="0" name="Picture 8"/>
+                    <pic:cNvPicPr>
+                      <a:picLocks noChangeAspect="1" noChangeArrowheads="1"/>
+                    </pic:cNvPicPr>
+                  </pic:nvPicPr>
+                  <pic:blipFill>
+                    <a:blip r:embed="rId11">
+                      <a:extLst>
+                        <a:ext uri="{28A0092B-C50C-407E-A947-70E740481C1C}">
+                          <a14:useLocalDpi xmlns:a14="http://schemas.microsoft.com/office/drawing/2010/main" val="0"/>
+                        </a:ext>
+                      </a:extLst>
+                    </a:blip>
+                    <a:srcRect/>
+                    <a:stretch>
+                      <a:fillRect/>
+                    </a:stretch>
+                  </pic:blipFill>
+                  <pic:spPr bwMode="auto">
+                    <a:xfrm>
+                      <a:off x="0" y="0"/>
+                      <a:ext cx="5539740" cy="3063240"/>
+                    </a:xfrm>
+                    <a:prstGeom prst="rect">
+                      <a:avLst/>
+                    </a:prstGeom>
+                    <a:noFill/>
+                    <a:ln>
+                      <a:noFill/>
+                    </a:ln>
+                  </pic:spPr>
+                </pic:pic>
+              </a:graphicData>
+            </a:graphic>
+          </wp:inline>
+        </w:drawing>
+      </w:r>
+    </w:p>
+    <w:p>
+      <w:pPr>
+        <w:spacing w:line="360" w:lineRule="auto"/>
+        <w:ind w:firstLine="0"/>
+        <w:jc w:val="left"/>
+        <w:rPr>
+          <w:rFonts w:eastAsia="Times New Roman" w:cs="Times New Roman"/>
+          <w:b/>
+          <w:bCs/>
+          <w:color w:val="000000"/>
+          <w:szCs w:val="24"/>
+          <w:lang w:eastAsia="es-EC"/>
+        </w:rPr>
+      </w:pPr>
+    </w:p>
+    <w:p>
+      <w:pPr>
+        <w:spacing w:line="360" w:lineRule="auto"/>
+        <w:ind w:firstLine="0"/>
+        <w:jc w:val="left"/>
+        <w:rPr>
+          <w:rFonts w:eastAsia="Times New Roman" w:cs="Times New Roman"/>
+          <w:szCs w:val="24"/>
+          <w:lang w:eastAsia="es-EC"/>
+        </w:rPr>
+      </w:pPr>
+      <w:r>
+        <w:rPr>
+          <w:rFonts w:eastAsia="Times New Roman" w:cs="Times New Roman"/>
+          <w:b/>
+          <w:bCs/>
+          <w:color w:val="000000"/>
+          <w:szCs w:val="24"/>
+          <w:lang w:eastAsia="es-EC"/>
+        </w:rPr>
+        <w:t xml:space="preserve">Pantalla 2: RF-02. - </w:t>
+      </w:r>
+      <w:r>
+        <w:rPr>
+          <w:rFonts w:eastAsia="Times New Roman" w:cs="Times New Roman"/>
+          <w:color w:val="000000"/>
+          <w:szCs w:val="24"/>
+          <w:lang w:eastAsia="es-EC"/>
+        </w:rPr>
+        <w:t> El vendedor registra una venta seleccionando un artículo y una cantidad; el sistema descuenta automáticamente del stock.</w:t>
+      </w:r>
+    </w:p>
+    <w:p>
+      <w:pPr>
+        <w:spacing w:line="360" w:lineRule="auto"/>
+        <w:ind w:firstLine="0"/>
+        <w:jc w:val="left"/>
+        <w:rPr>
+          <w:rFonts w:eastAsia="Times New Roman" w:cs="Times New Roman"/>
+          <w:szCs w:val="24"/>
+          <w:lang w:eastAsia="es-EC"/>
+        </w:rPr>
+      </w:pPr>
+      <w:r>
+        <w:rPr>
+          <w:rFonts w:eastAsia="Times New Roman" w:cs="Times New Roman"/>
+          <w:noProof/>
+          <w:color w:val="000000"/>
+          <w:szCs w:val="24"/>
+          <w:lang w:eastAsia="es-EC"/>
+        </w:rPr>
+        <w:drawing>
+          <wp:inline distT="0" distB="0" distL="0" distR="0" wp14:anchorId="137303B9" wp14:editId="3E6299C9">
+            <wp:extent cx="5730240" cy="2964180"/>
+            <wp:effectExtent l="0" t="0" r="3810" b="7620"/>
+            <wp:docPr id="9" name="Imagen 6"/>
+            <wp:cNvGraphicFramePr>
+              <a:graphicFrameLocks xmlns:a="http://schemas.openxmlformats.org/drawingml/2006/main" noChangeAspect="1"/>
+            </wp:cNvGraphicFramePr>
+            <a:graphic xmlns:a="http://schemas.openxmlformats.org/drawingml/2006/main">
+              <a:graphicData uri="http://schemas.openxmlformats.org/drawingml/2006/picture">
+                <pic:pic xmlns:pic="http://schemas.openxmlformats.org/drawingml/2006/picture">
+                  <pic:nvPicPr>
+                    <pic:cNvPr id="0" name="Picture 9"/>
+                    <pic:cNvPicPr>
+                      <a:picLocks noChangeAspect="1" noChangeArrowheads="1"/>
+                    </pic:cNvPicPr>
+                  </pic:nvPicPr>
+                  <pic:blipFill>
+                    <a:blip r:embed="rId12">
+                      <a:extLst>
+                        <a:ext uri="{28A0092B-C50C-407E-A947-70E740481C1C}">
+                          <a14:useLocalDpi xmlns:a14="http://schemas.microsoft.com/office/drawing/2010/main" val="0"/>
+                        </a:ext>
+                      </a:extLst>
+                    </a:blip>
+                    <a:srcRect/>
+                    <a:stretch>
+                      <a:fillRect/>
+                    </a:stretch>
+                  </pic:blipFill>
+                  <pic:spPr bwMode="auto">
+                    <a:xfrm>
+                      <a:off x="0" y="0"/>
+                      <a:ext cx="5730240" cy="2964180"/>
+                    </a:xfrm>
+                    <a:prstGeom prst="rect">
+                      <a:avLst/>
+                    </a:prstGeom>
+                    <a:noFill/>
+                    <a:ln>
+                      <a:noFill/>
+                    </a:ln>
+                  </pic:spPr>
+                </pic:pic>
+              </a:graphicData>
+            </a:graphic>
+          </wp:inline>
+        </w:drawing>
+      </w:r>
+    </w:p>
+    <w:p>
+      <w:pPr>
+        <w:spacing w:line="360" w:lineRule="auto"/>
+        <w:ind w:firstLine="0"/>
+        <w:jc w:val="left"/>
+        <w:rPr>
+          <w:rFonts w:eastAsia="Times New Roman" w:cs="Times New Roman"/>
+          <w:szCs w:val="24"/>
+          <w:lang w:eastAsia="es-EC"/>
+        </w:rPr>
+      </w:pPr>
+    </w:p>
+    <w:p>
+      <w:pPr>
+        <w:spacing w:line="360" w:lineRule="auto"/>
+        <w:ind w:firstLine="0"/>
+        <w:jc w:val="left"/>
+        <w:rPr>
+          <w:rFonts w:eastAsia="Times New Roman" w:cs="Times New Roman"/>
+          <w:szCs w:val="24"/>
+          <w:lang w:eastAsia="es-EC"/>
+        </w:rPr>
+      </w:pPr>
+      <w:r>
+        <w:rPr>
+          <w:rFonts w:eastAsia="Times New Roman" w:cs="Times New Roman"/>
+          <w:b/>
+          <w:bCs/>
+          <w:color w:val="000000"/>
+          <w:szCs w:val="24"/>
+          <w:lang w:eastAsia="es-EC"/>
+        </w:rPr>
+        <w:lastRenderedPageBreak/>
+        <w:t>Pantalla 3: RF-03</w:t>
+      </w:r>
+      <w:r>
+        <w:rPr>
+          <w:rFonts w:eastAsia="Times New Roman" w:cs="Times New Roman"/>
+          <w:color w:val="000000"/>
+          <w:szCs w:val="24"/>
+          <w:lang w:eastAsia="es-EC"/>
+        </w:rPr>
+        <w:t>. - El sistema alerta al vendedor con un mensaje visual cuando un artículo alcanza o está por debajo de su stock mínimo.</w:t>
+      </w:r>
+    </w:p>
+    <w:p>
+      <w:pPr>
+        <w:spacing w:line="360" w:lineRule="auto"/>
+        <w:ind w:firstLine="0"/>
+        <w:jc w:val="left"/>
+        <w:rPr>
+          <w:rFonts w:eastAsia="Times New Roman" w:cs="Times New Roman"/>
+          <w:szCs w:val="24"/>
+          <w:lang w:eastAsia="es-EC"/>
+        </w:rPr>
+      </w:pPr>
+    </w:p>
+    <w:p>
+      <w:pPr>
+        <w:spacing w:line="360" w:lineRule="auto"/>
+        <w:ind w:firstLine="0"/>
+        <w:jc w:val="left"/>
+        <w:rPr>
+          <w:rFonts w:eastAsia="Times New Roman" w:cs="Times New Roman"/>
+          <w:szCs w:val="24"/>
+          <w:lang w:eastAsia="es-EC"/>
+        </w:rPr>
+      </w:pPr>
+      <w:r>
+        <w:rPr>
+          <w:rFonts w:eastAsia="Times New Roman" w:cs="Times New Roman"/>
+          <w:noProof/>
+          <w:color w:val="000000"/>
+          <w:szCs w:val="24"/>
+          <w:lang w:eastAsia="es-EC"/>
+        </w:rPr>
+        <w:drawing>
+          <wp:inline distT="0" distB="0" distL="0" distR="0" wp14:anchorId="67B29C18" wp14:editId="4A1B2A06">
+            <wp:extent cx="5737860" cy="2331720"/>
+            <wp:effectExtent l="0" t="0" r="0" b="0"/>
+            <wp:docPr id="10" name="Imagen 5"/>
+            <wp:cNvGraphicFramePr>
+              <a:graphicFrameLocks xmlns:a="http://schemas.openxmlformats.org/drawingml/2006/main" noChangeAspect="1"/>
+            </wp:cNvGraphicFramePr>
+            <a:graphic xmlns:a="http://schemas.openxmlformats.org/drawingml/2006/main">
+              <a:graphicData uri="http://schemas.openxmlformats.org/drawingml/2006/picture">
+                <pic:pic xmlns:pic="http://schemas.openxmlformats.org/drawingml/2006/picture">
+                  <pic:nvPicPr>
+                    <pic:cNvPr id="0" name="Picture 10"/>
+                    <pic:cNvPicPr>
+                      <a:picLocks noChangeAspect="1" noChangeArrowheads="1"/>
+                    </pic:cNvPicPr>
+                  </pic:nvPicPr>
+                  <pic:blipFill>
+                    <a:blip r:embed="rId13">
+                      <a:extLst>
+                        <a:ext uri="{28A0092B-C50C-407E-A947-70E740481C1C}">
+                          <a14:useLocalDpi xmlns:a14="http://schemas.microsoft.com/office/drawing/2010/main" val="0"/>
+                        </a:ext>
+                      </a:extLst>
+                    </a:blip>
+                    <a:srcRect/>
+                    <a:stretch>
+                      <a:fillRect/>
+                    </a:stretch>
+                  </pic:blipFill>
+                  <pic:spPr bwMode="auto">
+                    <a:xfrm>
+                      <a:off x="0" y="0"/>
+                      <a:ext cx="5737860" cy="2331720"/>
+                    </a:xfrm>
+                    <a:prstGeom prst="rect">
+                      <a:avLst/>
+                    </a:prstGeom>
+                    <a:noFill/>
+                    <a:ln>
+                      <a:noFill/>
+                    </a:ln>
+                  </pic:spPr>
+                </pic:pic>
+              </a:graphicData>
+            </a:graphic>
+          </wp:inline>
+        </w:drawing>
+      </w:r>
+    </w:p>
+    <w:p>
+      <w:pPr>
+        <w:spacing w:line="360" w:lineRule="auto"/>
+        <w:ind w:firstLine="0"/>
+        <w:jc w:val="left"/>
+        <w:rPr>
+          <w:rFonts w:eastAsia="Times New Roman" w:cs="Times New Roman"/>
+          <w:szCs w:val="24"/>
+          <w:lang w:eastAsia="es-EC"/>
+        </w:rPr>
+      </w:pPr>
+    </w:p>
+    <w:p>
+      <w:pPr>
+        <w:pStyle w:val="Prrafodelista"/>
+        <w:numPr>
+          <w:ilvl w:val="0"/>
+          <w:numId w:val="10"/>
+        </w:numPr>
+        <w:spacing w:line="360" w:lineRule="auto"/>
+        <w:jc w:val="left"/>
+        <w:rPr>
+          <w:rFonts w:eastAsia="Times New Roman" w:cs="Times New Roman"/>
+          <w:b/>
+          <w:bCs/>
+          <w:szCs w:val="24"/>
+          <w:lang w:eastAsia="es-EC"/>
+        </w:rPr>
+      </w:pPr>
+      <w:r>
+        <w:rPr>
+          <w:rFonts w:eastAsia="Times New Roman" w:cs="Times New Roman"/>
+          <w:b/>
+          <w:bCs/>
+          <w:color w:val="000000"/>
+          <w:szCs w:val="24"/>
+          <w:lang w:eastAsia="es-EC"/>
+        </w:rPr>
+        <w:t xml:space="preserve">enlace </w:t>
+      </w:r>
+      <w:r>
+        <w:rPr>
+          <w:rFonts w:eastAsia="Times New Roman" w:cs="Times New Roman"/>
+          <w:b/>
+          <w:bCs/>
+          <w:color w:val="000000"/>
+          <w:szCs w:val="24"/>
+          <w:lang w:eastAsia="es-EC"/>
+        </w:rPr>
+        <w:t>del repositorio</w:t>
+      </w:r>
+      <w:r>
+        <w:rPr>
+          <w:rFonts w:eastAsia="Times New Roman" w:cs="Times New Roman"/>
+          <w:b/>
+          <w:bCs/>
+          <w:color w:val="000000"/>
+          <w:szCs w:val="24"/>
+          <w:lang w:eastAsia="es-EC"/>
+        </w:rPr>
+        <w:t>: </w:t>
+      </w:r>
+    </w:p>
+    <w:p>
+      <w:pPr>
+        <w:spacing w:after="240" w:line="360" w:lineRule="auto"/>
+        <w:ind w:firstLine="0"/>
+        <w:jc w:val="left"/>
+        <w:rPr>
+          <w:rFonts w:eastAsia="Times New Roman" w:cs="Times New Roman"/>
+          <w:b/>
+          <w:bCs/>
+          <w:szCs w:val="24"/>
+          <w:lang w:eastAsia="es-EC"/>
+        </w:rPr>
+      </w:pPr>
+      <w:r>
+        <w:rPr>
+          <w:rFonts w:eastAsia="Times New Roman" w:cs="Times New Roman"/>
+          <w:b/>
+          <w:bCs/>
+          <w:szCs w:val="24"/>
+          <w:lang w:eastAsia="es-EC"/>
+        </w:rPr>
+        <w:tab/>
+      </w:r>
+      <w:hyperlink r:id="rId14" w:history="1">
+        <w:r>
+          <w:rPr>
+            <w:rStyle w:val="Hipervnculo"/>
+            <w:rFonts w:eastAsia="Times New Roman" w:cs="Times New Roman"/>
+            <w:b/>
+            <w:bCs/>
+            <w:szCs w:val="24"/>
+            <w:lang w:eastAsia="es-EC"/>
+          </w:rPr>
+          <w:t>https://github.com/maelbusan-cell/PapelStock_Grupo7</w:t>
+        </w:r>
+      </w:hyperlink>
+    </w:p>
+    <w:p>
+      <w:pPr>
+        <w:pStyle w:val="Prrafodelista"/>
+        <w:numPr>
+          <w:ilvl w:val="0"/>
+          <w:numId w:val="10"/>
+        </w:numPr>
+        <w:spacing w:line="360" w:lineRule="auto"/>
+        <w:jc w:val="left"/>
+        <w:rPr>
+          <w:rFonts w:eastAsia="Times New Roman" w:cs="Times New Roman"/>
+          <w:b/>
+          <w:bCs/>
+          <w:szCs w:val="24"/>
+          <w:lang w:eastAsia="es-EC"/>
+        </w:rPr>
+      </w:pPr>
+      <w:r>
+        <w:rPr>
+          <w:rFonts w:eastAsia="Times New Roman" w:cs="Times New Roman"/>
+          <w:b/>
+          <w:bCs/>
+          <w:color w:val="000000"/>
+          <w:szCs w:val="24"/>
+          <w:lang w:eastAsia="es-EC"/>
+        </w:rPr>
+        <w:t>enlace del prototipo:</w:t>
+      </w:r>
+    </w:p>
+    <w:p>
+      <w:pPr>
+        <w:spacing w:line="360" w:lineRule="auto"/>
         <w:rPr>
           <w:color w:val="000000" w:themeColor="text1"/>
+          <w:szCs w:val="24"/>
         </w:rPr>
       </w:pPr>
     </w:p>
@@ -1408,7 +3428,7 @@
 </file>
 
 <file path=word/endnotes.xml><?xml version="1.0" encoding="utf-8"?>
-<w:endnotes xmlns:wpc="http://schemas.microsoft.com/office/word/2010/wordprocessingCanvas" xmlns:cx="http://schemas.microsoft.com/office/drawing/2014/chartex" xmlns:cx1="http://schemas.microsoft.com/office/drawing/2015/9/8/chartex" xmlns:cx2="http://schemas.microsoft.com/office/drawing/2015/10/21/chartex" xmlns:cx3="http://schemas.microsoft.com/office/drawing/2016/5/9/chartex" xmlns:cx4="http://schemas.microsoft.com/office/drawing/2016/5/10/chartex" xmlns:cx5="http://schemas.microsoft.com/office/drawing/2016/5/11/chartex" xmlns:cx6="http://schemas.microsoft.com/office/drawing/2016/5/12/chartex" xmlns:cx7="http://schemas.microsoft.com/office/drawing/2016/5/13/chartex" xmlns:cx8="http://schemas.microsoft.com/office/drawing/2016/5/14/chartex" xmlns:mc="http://schemas.openxmlformats.org/markup-compatibility/2006" xmlns:aink="http://schemas.microsoft.com/office/drawing/2016/ink" xmlns:am3d="http://schemas.microsoft.com/office/drawing/2017/model3d" xmlns:o="urn:schemas-microsoft-com:office:office" xmlns:oel="http://schemas.microsoft.com/office/2019/extlst" xmlns:r="http://schemas.openxmlformats.org/officeDocument/2006/relationships" xmlns:m="http://schemas.openxmlformats.org/officeDocument/2006/math" xmlns:v="urn:schemas-microsoft-com:vml" xmlns:wp14="http://schemas.microsoft.com/office/word/2010/wordprocessingDrawing" xmlns:wp="http://schemas.openxmlformats.org/drawingml/2006/wordprocessingDrawing" xmlns:w10="urn:schemas-microsoft-com:office:word" xmlns:w="http://schemas.openxmlformats.org/wordprocessingml/2006/main" xmlns:w14="http://schemas.microsoft.com/office/word/2010/wordml" xmlns:w15="http://schemas.microsoft.com/office/word/2012/wordml" xmlns:w16cex="http://schemas.microsoft.com/office/word/2018/wordml/cex" xmlns:w16cid="http://schemas.microsoft.com/office/word/2016/wordml/cid" xmlns:w16="http://schemas.microsoft.com/office/word/2018/wordml" xmlns:w16du="http://schemas.microsoft.com/office/word/2023/wordml/word16du" xmlns:w16sdtdh="http://schemas.microsoft.com/office/word/2020/wordml/sdtdatahash" xmlns:w16sdtfl="http://schemas.microsoft.com/office/word/2024/wordml/sdtformatlock" xmlns:w16se="http://schemas.microsoft.com/office/word/2015/wordml/symex" xmlns:wpg="http://schemas.microsoft.com/office/word/2010/wordprocessingGroup" xmlns:wpi="http://schemas.microsoft.com/office/word/2010/wordprocessingInk" xmlns:wne="http://schemas.microsoft.com/office/word/2006/wordml" xmlns:wps="http://schemas.microsoft.com/office/word/2010/wordprocessingShape" mc:Ignorable="w14 w15 w16se w16cid w16 w16cex w16sdtdh w16sdtfl w16du wp14">
+<w:endnotes xmlns:wpc="http://schemas.microsoft.com/office/word/2010/wordprocessingCanvas" xmlns:cx="http://schemas.microsoft.com/office/drawing/2014/chartex" xmlns:cx1="http://schemas.microsoft.com/office/drawing/2015/9/8/chartex" xmlns:cx2="http://schemas.microsoft.com/office/drawing/2015/10/21/chartex" xmlns:cx3="http://schemas.microsoft.com/office/drawing/2016/5/9/chartex" xmlns:cx4="http://schemas.microsoft.com/office/drawing/2016/5/10/chartex" xmlns:cx5="http://schemas.microsoft.com/office/drawing/2016/5/11/chartex" xmlns:cx6="http://schemas.microsoft.com/office/drawing/2016/5/12/chartex" xmlns:cx7="http://schemas.microsoft.com/office/drawing/2016/5/13/chartex" xmlns:cx8="http://schemas.microsoft.com/office/drawing/2016/5/14/chartex" xmlns:mc="http://schemas.openxmlformats.org/markup-compatibility/2006" xmlns:aink="http://schemas.microsoft.com/office/drawing/2016/ink" xmlns:am3d="http://schemas.microsoft.com/office/drawing/2017/model3d" xmlns:o="urn:schemas-microsoft-com:office:office" xmlns:oel="http://schemas.microsoft.com/office/2019/extlst" xmlns:r="http://schemas.openxmlformats.org/officeDocument/2006/relationships" xmlns:m="http://schemas.openxmlformats.org/officeDocument/2006/math" xmlns:v="urn:schemas-microsoft-com:vml" xmlns:wp14="http://schemas.microsoft.com/office/word/2010/wordprocessingDrawing" xmlns:wp="http://schemas.openxmlformats.org/drawingml/2006/wordprocessingDrawing" xmlns:w10="urn:schemas-microsoft-com:office:word" xmlns:w="http://schemas.openxmlformats.org/wordprocessingml/2006/main" xmlns:w14="http://schemas.microsoft.com/office/word/2010/wordml" xmlns:w15="http://schemas.microsoft.com/office/word/2012/wordml" xmlns:w16cei="http://schemas.microsoft.com/office/word/2026/wordml/cei" xmlns:w16cex="http://schemas.microsoft.com/office/word/2018/wordml/cex" xmlns:w16cid="http://schemas.microsoft.com/office/word/2016/wordml/cid" xmlns:w16="http://schemas.microsoft.com/office/word/2018/wordml" xmlns:w16du="http://schemas.microsoft.com/office/word/2023/wordml/word16du" xmlns:w16sdtdh="http://schemas.microsoft.com/office/word/2020/wordml/sdtdatahash" xmlns:w16sdtfl="http://schemas.microsoft.com/office/word/2024/wordml/sdtformatlock" xmlns:w16se="http://schemas.microsoft.com/office/word/2015/wordml/symex" xmlns:wpg="http://schemas.microsoft.com/office/word/2010/wordprocessingGroup" xmlns:wpi="http://schemas.microsoft.com/office/word/2010/wordprocessingInk" xmlns:wne="http://schemas.microsoft.com/office/word/2006/wordml" xmlns:wps="http://schemas.microsoft.com/office/word/2010/wordprocessingShape" mc:Ignorable="w14 w15 w16se w16cid w16 w16cex w16sdtdh w16sdtfl w16du wp14">
   <w:endnote w:type="separator" w:id="-1">
     <w:p>
       <w:pPr>
@@ -1433,7 +3453,7 @@
 </file>
 
 <file path=word/footnotes.xml><?xml version="1.0" encoding="utf-8"?>
-<w:footnotes xmlns:wpc="http://schemas.microsoft.com/office/word/2010/wordprocessingCanvas" xmlns:cx="http://schemas.microsoft.com/office/drawing/2014/chartex" xmlns:cx1="http://schemas.microsoft.com/office/drawing/2015/9/8/chartex" xmlns:cx2="http://schemas.microsoft.com/office/drawing/2015/10/21/chartex" xmlns:cx3="http://schemas.microsoft.com/office/drawing/2016/5/9/chartex" xmlns:cx4="http://schemas.microsoft.com/office/drawing/2016/5/10/chartex" xmlns:cx5="http://schemas.microsoft.com/office/drawing/2016/5/11/chartex" xmlns:cx6="http://schemas.microsoft.com/office/drawing/2016/5/12/chartex" xmlns:cx7="http://schemas.microsoft.com/office/drawing/2016/5/13/chartex" xmlns:cx8="http://schemas.microsoft.com/office/drawing/2016/5/14/chartex" xmlns:mc="http://schemas.openxmlformats.org/markup-compatibility/2006" xmlns:aink="http://schemas.microsoft.com/office/drawing/2016/ink" xmlns:am3d="http://schemas.microsoft.com/office/drawing/2017/model3d" xmlns:o="urn:schemas-microsoft-com:office:office" xmlns:oel="http://schemas.microsoft.com/office/2019/extlst" xmlns:r="http://schemas.openxmlformats.org/officeDocument/2006/relationships" xmlns:m="http://schemas.openxmlformats.org/officeDocument/2006/math" xmlns:v="urn:schemas-microsoft-com:vml" xmlns:wp14="http://schemas.microsoft.com/office/word/2010/wordprocessingDrawing" xmlns:wp="http://schemas.openxmlformats.org/drawingml/2006/wordprocessingDrawing" xmlns:w10="urn:schemas-microsoft-com:office:word" xmlns:w="http://schemas.openxmlformats.org/wordprocessingml/2006/main" xmlns:w14="http://schemas.microsoft.com/office/word/2010/wordml" xmlns:w15="http://schemas.microsoft.com/office/word/2012/wordml" xmlns:w16cex="http://schemas.microsoft.com/office/word/2018/wordml/cex" xmlns:w16cid="http://schemas.microsoft.com/office/word/2016/wordml/cid" xmlns:w16="http://schemas.microsoft.com/office/word/2018/wordml" xmlns:w16du="http://schemas.microsoft.com/office/word/2023/wordml/word16du" xmlns:w16sdtdh="http://schemas.microsoft.com/office/word/2020/wordml/sdtdatahash" xmlns:w16sdtfl="http://schemas.microsoft.com/office/word/2024/wordml/sdtformatlock" xmlns:w16se="http://schemas.microsoft.com/office/word/2015/wordml/symex" xmlns:wpg="http://schemas.microsoft.com/office/word/2010/wordprocessingGroup" xmlns:wpi="http://schemas.microsoft.com/office/word/2010/wordprocessingInk" xmlns:wne="http://schemas.microsoft.com/office/word/2006/wordml" xmlns:wps="http://schemas.microsoft.com/office/word/2010/wordprocessingShape" mc:Ignorable="w14 w15 w16se w16cid w16 w16cex w16sdtdh w16sdtfl w16du wp14">
+<w:footnotes xmlns:wpc="http://schemas.microsoft.com/office/word/2010/wordprocessingCanvas" xmlns:cx="http://schemas.microsoft.com/office/drawing/2014/chartex" xmlns:cx1="http://schemas.microsoft.com/office/drawing/2015/9/8/chartex" xmlns:cx2="http://schemas.microsoft.com/office/drawing/2015/10/21/chartex" xmlns:cx3="http://schemas.microsoft.com/office/drawing/2016/5/9/chartex" xmlns:cx4="http://schemas.microsoft.com/office/drawing/2016/5/10/chartex" xmlns:cx5="http://schemas.microsoft.com/office/drawing/2016/5/11/chartex" xmlns:cx6="http://schemas.microsoft.com/office/drawing/2016/5/12/chartex" xmlns:cx7="http://schemas.microsoft.com/office/drawing/2016/5/13/chartex" xmlns:cx8="http://schemas.microsoft.com/office/drawing/2016/5/14/chartex" xmlns:mc="http://schemas.openxmlformats.org/markup-compatibility/2006" xmlns:aink="http://schemas.microsoft.com/office/drawing/2016/ink" xmlns:am3d="http://schemas.microsoft.com/office/drawing/2017/model3d" xmlns:o="urn:schemas-microsoft-com:office:office" xmlns:oel="http://schemas.microsoft.com/office/2019/extlst" xmlns:r="http://schemas.openxmlformats.org/officeDocument/2006/relationships" xmlns:m="http://schemas.openxmlformats.org/officeDocument/2006/math" xmlns:v="urn:schemas-microsoft-com:vml" xmlns:wp14="http://schemas.microsoft.com/office/word/2010/wordprocessingDrawing" xmlns:wp="http://schemas.openxmlformats.org/drawingml/2006/wordprocessingDrawing" xmlns:w10="urn:schemas-microsoft-com:office:word" xmlns:w="http://schemas.openxmlformats.org/wordprocessingml/2006/main" xmlns:w14="http://schemas.microsoft.com/office/word/2010/wordml" xmlns:w15="http://schemas.microsoft.com/office/word/2012/wordml" xmlns:w16cei="http://schemas.microsoft.com/office/word/2026/wordml/cei" xmlns:w16cex="http://schemas.microsoft.com/office/word/2018/wordml/cex" xmlns:w16cid="http://schemas.microsoft.com/office/word/2016/wordml/cid" xmlns:w16="http://schemas.microsoft.com/office/word/2018/wordml" xmlns:w16du="http://schemas.microsoft.com/office/word/2023/wordml/word16du" xmlns:w16sdtdh="http://schemas.microsoft.com/office/word/2020/wordml/sdtdatahash" xmlns:w16sdtfl="http://schemas.microsoft.com/office/word/2024/wordml/sdtformatlock" xmlns:w16se="http://schemas.microsoft.com/office/word/2015/wordml/symex" xmlns:wpg="http://schemas.microsoft.com/office/word/2010/wordprocessingGroup" xmlns:wpi="http://schemas.microsoft.com/office/word/2010/wordprocessingInk" xmlns:wne="http://schemas.microsoft.com/office/word/2006/wordml" xmlns:wps="http://schemas.microsoft.com/office/word/2010/wordprocessingShape" mc:Ignorable="w14 w15 w16se w16cid w16 w16cex w16sdtdh w16sdtfl w16du wp14">
   <w:footnote w:type="separator" w:id="-1">
     <w:p>
       <w:pPr>
@@ -1458,7 +3478,7 @@
 </file>
 
 <file path=word/numbering.xml><?xml version="1.0" encoding="utf-8"?>
-<w:numbering xmlns:wpc="http://schemas.microsoft.com/office/word/2010/wordprocessingCanvas" xmlns:cx="http://schemas.microsoft.com/office/drawing/2014/chartex" xmlns:cx1="http://schemas.microsoft.com/office/drawing/2015/9/8/chartex" xmlns:cx2="http://schemas.microsoft.com/office/drawing/2015/10/21/chartex" xmlns:cx3="http://schemas.microsoft.com/office/drawing/2016/5/9/chartex" xmlns:cx4="http://schemas.microsoft.com/office/drawing/2016/5/10/chartex" xmlns:cx5="http://schemas.microsoft.com/office/drawing/2016/5/11/chartex" xmlns:cx6="http://schemas.microsoft.com/office/drawing/2016/5/12/chartex" xmlns:cx7="http://schemas.microsoft.com/office/drawing/2016/5/13/chartex" xmlns:cx8="http://schemas.microsoft.com/office/drawing/2016/5/14/chartex" xmlns:mc="http://schemas.openxmlformats.org/markup-compatibility/2006" xmlns:aink="http://schemas.microsoft.com/office/drawing/2016/ink" xmlns:am3d="http://schemas.microsoft.com/office/drawing/2017/model3d" xmlns:o="urn:schemas-microsoft-com:office:office" xmlns:oel="http://schemas.microsoft.com/office/2019/extlst" xmlns:r="http://schemas.openxmlformats.org/officeDocument/2006/relationships" xmlns:m="http://schemas.openxmlformats.org/officeDocument/2006/math" xmlns:v="urn:schemas-microsoft-com:vml" xmlns:wp14="http://schemas.microsoft.com/office/word/2010/wordprocessingDrawing" xmlns:wp="http://schemas.openxmlformats.org/drawingml/2006/wordprocessingDrawing" xmlns:w10="urn:schemas-microsoft-com:office:word" xmlns:w="http://schemas.openxmlformats.org/wordprocessingml/2006/main" xmlns:w14="http://schemas.microsoft.com/office/word/2010/wordml" xmlns:w15="http://schemas.microsoft.com/office/word/2012/wordml" xmlns:w16cex="http://schemas.microsoft.com/office/word/2018/wordml/cex" xmlns:w16cid="http://schemas.microsoft.com/office/word/2016/wordml/cid" xmlns:w16="http://schemas.microsoft.com/office/word/2018/wordml" xmlns:w16du="http://schemas.microsoft.com/office/word/2023/wordml/word16du" xmlns:w16sdtdh="http://schemas.microsoft.com/office/word/2020/wordml/sdtdatahash" xmlns:w16sdtfl="http://schemas.microsoft.com/office/word/2024/wordml/sdtformatlock" xmlns:w16se="http://schemas.microsoft.com/office/word/2015/wordml/symex" xmlns:wpg="http://schemas.microsoft.com/office/word/2010/wordprocessingGroup" xmlns:wpi="http://schemas.microsoft.com/office/word/2010/wordprocessingInk" xmlns:wne="http://schemas.microsoft.com/office/word/2006/wordml" xmlns:wps="http://schemas.microsoft.com/office/word/2010/wordprocessingShape" mc:Ignorable="w14 w15 w16se w16cid w16 w16cex w16sdtdh w16sdtfl w16du wp14">
+<w:numbering xmlns:wpc="http://schemas.microsoft.com/office/word/2010/wordprocessingCanvas" xmlns:cx="http://schemas.microsoft.com/office/drawing/2014/chartex" xmlns:cx1="http://schemas.microsoft.com/office/drawing/2015/9/8/chartex" xmlns:cx2="http://schemas.microsoft.com/office/drawing/2015/10/21/chartex" xmlns:cx3="http://schemas.microsoft.com/office/drawing/2016/5/9/chartex" xmlns:cx4="http://schemas.microsoft.com/office/drawing/2016/5/10/chartex" xmlns:cx5="http://schemas.microsoft.com/office/drawing/2016/5/11/chartex" xmlns:cx6="http://schemas.microsoft.com/office/drawing/2016/5/12/chartex" xmlns:cx7="http://schemas.microsoft.com/office/drawing/2016/5/13/chartex" xmlns:cx8="http://schemas.microsoft.com/office/drawing/2016/5/14/chartex" xmlns:mc="http://schemas.openxmlformats.org/markup-compatibility/2006" xmlns:aink="http://schemas.microsoft.com/office/drawing/2016/ink" xmlns:am3d="http://schemas.microsoft.com/office/drawing/2017/model3d" xmlns:o="urn:schemas-microsoft-com:office:office" xmlns:oel="http://schemas.microsoft.com/office/2019/extlst" xmlns:r="http://schemas.openxmlformats.org/officeDocument/2006/relationships" xmlns:m="http://schemas.openxmlformats.org/officeDocument/2006/math" xmlns:v="urn:schemas-microsoft-com:vml" xmlns:wp14="http://schemas.microsoft.com/office/word/2010/wordprocessingDrawing" xmlns:wp="http://schemas.openxmlformats.org/drawingml/2006/wordprocessingDrawing" xmlns:w10="urn:schemas-microsoft-com:office:word" xmlns:w="http://schemas.openxmlformats.org/wordprocessingml/2006/main" xmlns:w14="http://schemas.microsoft.com/office/word/2010/wordml" xmlns:w15="http://schemas.microsoft.com/office/word/2012/wordml" xmlns:w16cei="http://schemas.microsoft.com/office/word/2026/wordml/cei" xmlns:w16cex="http://schemas.microsoft.com/office/word/2018/wordml/cex" xmlns:w16cid="http://schemas.microsoft.com/office/word/2016/wordml/cid" xmlns:w16="http://schemas.microsoft.com/office/word/2018/wordml" xmlns:w16du="http://schemas.microsoft.com/office/word/2023/wordml/word16du" xmlns:w16sdtdh="http://schemas.microsoft.com/office/word/2020/wordml/sdtdatahash" xmlns:w16sdtfl="http://schemas.microsoft.com/office/word/2024/wordml/sdtformatlock" xmlns:w16se="http://schemas.microsoft.com/office/word/2015/wordml/symex" xmlns:wpg="http://schemas.microsoft.com/office/word/2010/wordprocessingGroup" xmlns:wpi="http://schemas.microsoft.com/office/word/2010/wordprocessingInk" xmlns:wne="http://schemas.microsoft.com/office/word/2006/wordml" xmlns:wps="http://schemas.microsoft.com/office/word/2010/wordprocessingShape" mc:Ignorable="w14 w15 w16se w16cid w16 w16cex w16sdtdh w16sdtfl w16du wp14">
   <w:abstractNum w:abstractNumId="0" w15:restartNumberingAfterBreak="0">
     <w:nsid w:val="FFFFFF7C"/>
     <w:multiLevelType w:val="singleLevel"/>
@@ -1627,6 +3647,119 @@
       </w:pPr>
       <w:rPr>
         <w:rFonts w:ascii="Symbol" w:hAnsi="Symbol" w:hint="default"/>
+      </w:rPr>
+    </w:lvl>
+  </w:abstractNum>
+  <w:abstractNum w:abstractNumId="9" w15:restartNumberingAfterBreak="0">
+    <w:nsid w:val="75C12BF8"/>
+    <w:multiLevelType w:val="hybridMultilevel"/>
+    <w:tmpl w:val="CEECD1C6"/>
+    <w:lvl w:ilvl="0" w:tplc="300A0001">
+      <w:start w:val="1"/>
+      <w:numFmt w:val="bullet"/>
+      <w:lvlText w:val=""/>
+      <w:lvlJc w:val="left"/>
+      <w:pPr>
+        <w:ind w:left="720" w:hanging="360"/>
+      </w:pPr>
+      <w:rPr>
+        <w:rFonts w:ascii="Symbol" w:hAnsi="Symbol" w:hint="default"/>
+      </w:rPr>
+    </w:lvl>
+    <w:lvl w:ilvl="1" w:tplc="300A0003" w:tentative="1">
+      <w:start w:val="1"/>
+      <w:numFmt w:val="bullet"/>
+      <w:lvlText w:val="o"/>
+      <w:lvlJc w:val="left"/>
+      <w:pPr>
+        <w:ind w:left="1440" w:hanging="360"/>
+      </w:pPr>
+      <w:rPr>
+        <w:rFonts w:ascii="Courier New" w:hAnsi="Courier New" w:cs="Courier New" w:hint="default"/>
+      </w:rPr>
+    </w:lvl>
+    <w:lvl w:ilvl="2" w:tplc="300A0005" w:tentative="1">
+      <w:start w:val="1"/>
+      <w:numFmt w:val="bullet"/>
+      <w:lvlText w:val=""/>
+      <w:lvlJc w:val="left"/>
+      <w:pPr>
+        <w:ind w:left="2160" w:hanging="360"/>
+      </w:pPr>
+      <w:rPr>
+        <w:rFonts w:ascii="Wingdings" w:hAnsi="Wingdings" w:hint="default"/>
+      </w:rPr>
+    </w:lvl>
+    <w:lvl w:ilvl="3" w:tplc="300A0001" w:tentative="1">
+      <w:start w:val="1"/>
+      <w:numFmt w:val="bullet"/>
+      <w:lvlText w:val=""/>
+      <w:lvlJc w:val="left"/>
+      <w:pPr>
+        <w:ind w:left="2880" w:hanging="360"/>
+      </w:pPr>
+      <w:rPr>
+        <w:rFonts w:ascii="Symbol" w:hAnsi="Symbol" w:hint="default"/>
+      </w:rPr>
+    </w:lvl>
+    <w:lvl w:ilvl="4" w:tplc="300A0003" w:tentative="1">
+      <w:start w:val="1"/>
+      <w:numFmt w:val="bullet"/>
+      <w:lvlText w:val="o"/>
+      <w:lvlJc w:val="left"/>
+      <w:pPr>
+        <w:ind w:left="3600" w:hanging="360"/>
+      </w:pPr>
+      <w:rPr>
+        <w:rFonts w:ascii="Courier New" w:hAnsi="Courier New" w:cs="Courier New" w:hint="default"/>
+      </w:rPr>
+    </w:lvl>
+    <w:lvl w:ilvl="5" w:tplc="300A0005" w:tentative="1">
+      <w:start w:val="1"/>
+      <w:numFmt w:val="bullet"/>
+      <w:lvlText w:val=""/>
+      <w:lvlJc w:val="left"/>
+      <w:pPr>
+        <w:ind w:left="4320" w:hanging="360"/>
+      </w:pPr>
+      <w:rPr>
+        <w:rFonts w:ascii="Wingdings" w:hAnsi="Wingdings" w:hint="default"/>
+      </w:rPr>
+    </w:lvl>
+    <w:lvl w:ilvl="6" w:tplc="300A0001" w:tentative="1">
+      <w:start w:val="1"/>
+      <w:numFmt w:val="bullet"/>
+      <w:lvlText w:val=""/>
+      <w:lvlJc w:val="left"/>
+      <w:pPr>
+        <w:ind w:left="5040" w:hanging="360"/>
+      </w:pPr>
+      <w:rPr>
+        <w:rFonts w:ascii="Symbol" w:hAnsi="Symbol" w:hint="default"/>
+      </w:rPr>
+    </w:lvl>
+    <w:lvl w:ilvl="7" w:tplc="300A0003" w:tentative="1">
+      <w:start w:val="1"/>
+      <w:numFmt w:val="bullet"/>
+      <w:lvlText w:val="o"/>
+      <w:lvlJc w:val="left"/>
+      <w:pPr>
+        <w:ind w:left="5760" w:hanging="360"/>
+      </w:pPr>
+      <w:rPr>
+        <w:rFonts w:ascii="Courier New" w:hAnsi="Courier New" w:cs="Courier New" w:hint="default"/>
+      </w:rPr>
+    </w:lvl>
+    <w:lvl w:ilvl="8" w:tplc="300A0005" w:tentative="1">
+      <w:start w:val="1"/>
+      <w:numFmt w:val="bullet"/>
+      <w:lvlText w:val=""/>
+      <w:lvlJc w:val="left"/>
+      <w:pPr>
+        <w:ind w:left="6480" w:hanging="360"/>
+      </w:pPr>
+      <w:rPr>
+        <w:rFonts w:ascii="Wingdings" w:hAnsi="Wingdings" w:hint="default"/>
       </w:rPr>
     </w:lvl>
   </w:abstractNum>
@@ -1656,6 +3789,9 @@
   </w:num>
   <w:num w:numId="9" w16cid:durableId="663506434">
     <w:abstractNumId w:val="0"/>
+  </w:num>
+  <w:num w:numId="10" w16cid:durableId="1036273507">
+    <w:abstractNumId w:val="9"/>
   </w:num>
 </w:numbering>
 </file>
@@ -2273,7 +4409,6 @@
   <w:style w:type="character" w:default="1" w:styleId="Fuentedeprrafopredeter">
     <w:name w:val="Default Paragraph Font"/>
     <w:uiPriority w:val="1"/>
-    <w:semiHidden/>
     <w:unhideWhenUsed/>
   </w:style>
   <w:style w:type="table" w:default="1" w:styleId="Tablanormal">
@@ -13078,6 +15213,29 @@
       <w:sz w:val="28"/>
       <w:szCs w:val="24"/>
       <w:lang w:val="es-EC"/>
+    </w:rPr>
+  </w:style>
+  <w:style w:type="character" w:styleId="Hipervnculo">
+    <w:name w:val="Hyperlink"/>
+    <w:basedOn w:val="Fuentedeprrafopredeter"/>
+    <w:uiPriority w:val="99"/>
+    <w:unhideWhenUsed/>
+    <w:rsid w:val="001955C4"/>
+    <w:rPr>
+      <w:color w:val="0000FF" w:themeColor="hyperlink"/>
+      <w:u w:val="single"/>
+    </w:rPr>
+  </w:style>
+  <w:style w:type="character" w:styleId="Mencinsinresolver">
+    <w:name w:val="Unresolved Mention"/>
+    <w:basedOn w:val="Fuentedeprrafopredeter"/>
+    <w:uiPriority w:val="99"/>
+    <w:semiHidden/>
+    <w:unhideWhenUsed/>
+    <w:rsid w:val="001955C4"/>
+    <w:rPr>
+      <w:color w:val="605E5C"/>
+      <w:shd w:val="clear" w:color="auto" w:fill="E1DFDD"/>
     </w:rPr>
   </w:style>
 </w:styles>

</xml_diff>